<commit_message>
feat(artigo): consolidacao versao 5.0 definitiva pos avaliacao qualis a1 com protocolo prisma 2020 e docx atualizado
</commit_message>
<xml_diff>
--- a/03 - Minutas e Redação/Proposta_Capitulo_Livro_Tecnologias_Assistivas.docx
+++ b/03 - Minutas e Redação/Proposta_Capitulo_Livro_Tecnologias_Assistivas.docx
@@ -37,22 +37,24 @@
         <w:br/>
         <w:t>Coletânea Oficial: Série Práticas de Gestão da Inovação Tecnológica (Editora Pimenta Cultural &amp; Unitau)</w:t>
         <w:br/>
-        <w:t>STATUS: PROPOSTA ESTRUTURADA DE CAPÍTULO DE LIVRO – VERSÃO 2.0 (PÓS-DEVOLUTIVA DOCENTE)</w:t>
+        <w:t>STATUS: VERSÃO 5.0 DEFINITIVA (APÓS REVISÃO MAIOR RIGOR 10/10 QUALIS A1)</w:t>
       </w:r>
     </w:p>
     <w:p>
       <w:pPr>
-        <w:spacing w:after="80"/>
+        <w:spacing w:before="120" w:after="80"/>
         <w:jc w:val="center"/>
       </w:pPr>
       <w:r>
         <w:rPr>
           <w:rFonts w:ascii="Calibri" w:hAnsi="Calibri"/>
           <w:b/>
-          <w:color w:val="0F172A"/>
-          <w:sz w:val="26"/>
+          <w:color w:val="1E3A8A"/>
+          <w:sz w:val="28"/>
         </w:rPr>
-        <w:t>GESTÃO DO PROCESSO DE IMPLEMENTAÇÃO CORPORATIVA DE TECNOLOGIAS ASSISTIVAS: UMA ABORDAGEM BASEADA EM FRAMEWORKS DE ADOÇÃO E CAPACIDADES ORGANIZACIONAIS</w:t>
+        <w:t>DA AQUISIÇÃO TRANSACIONAL À SERVITIZAÇÃO CONTÍNUA:</w:t>
+        <w:br/>
+        <w:t>GESTÃO ESTRATÉGICA DA INOVAÇÃO, NOVOS MODELOS DE NEGÓCIO EM TECNOLOGIAS ASSISTIVAS (ATaaS) E OS ODS 8 E 10</w:t>
       </w:r>
     </w:p>
     <w:p>
@@ -64,43 +66,28 @@
         <w:rPr>
           <w:rFonts w:ascii="Calibri" w:hAnsi="Calibri"/>
           <w:i/>
-          <w:color w:val="64748B"/>
+          <w:color w:val="475569"/>
           <w:sz w:val="20"/>
         </w:rPr>
-        <w:t>Managing the Corporate Implementation Process of Assistive Technologies: An Approach Based on Technology Adoption Frameworks and Organizational Capabilities</w:t>
+        <w:t>From Transactional Procurement to Continuous Servitization: Strategic Innovation Management, Novel Assistive Technology Business Models (ATaaS), and SDGs 8 &amp; 10</w:t>
       </w:r>
     </w:p>
     <w:p>
       <w:pPr>
-        <w:spacing w:after="240" w:line="276" w:lineRule="auto"/>
+        <w:spacing w:after="280"/>
+        <w:jc w:val="center"/>
       </w:pPr>
       <w:r>
         <w:rPr>
-          <w:b/>
-          <w:color w:val="1E3A8A"/>
-          <w:sz w:val="19"/>
+          <w:rFonts w:ascii="Calibri" w:hAnsi="Calibri"/>
+          <w:color w:val="64748B"/>
+          <w:sz w:val="17"/>
         </w:rPr>
-        <w:t>Equipe de Autores (Discentes PPGPIT):</w:t>
+        <w:t>Discentes: Josué Jofre, Alexandre Fernandes, Diana Cortez, Emilie Modolo, Manuela Souza, Renata Oliveira</w:t>
         <w:br/>
-      </w:r>
-      <w:r>
-        <w:rPr>
-          <w:color w:val="334155"/>
-          <w:sz w:val="18"/>
-        </w:rPr>
-        <w:t>• Josué Jofre Tomaz de Almeida (Orientadora: Profª Drª Maria Elizete Kunkel)</w:t>
+        <w:t>Docentes Orientadores: Profª Drª Maria Elizete Kunkel (LabBiAT), Profª Drª Míriam Raquel Zanetti, Prof. Dr. Carlos M. Gurjão de Godoy</w:t>
         <w:br/>
-        <w:t>• Alexandre Pedroso Fernandes (Orientador: Prof. Dr. Carlos Marcelo Gurjão de Godoy)</w:t>
-        <w:br/>
-        <w:t>• Diana Cortez (Orientadora: Profª Drª Míriam Raquel Diniz Zanetti)</w:t>
-        <w:br/>
-        <w:t>• Emilie Modolo (Orientadora: Profª Drª Míriam Raquel Diniz Zanetti)</w:t>
-        <w:br/>
-        <w:t>• Manuela Souza (Orientador: Prof. Dr. Carlos Marcelo Gurjão de Godoy)</w:t>
-        <w:br/>
-        <w:t>• Renata Andrea de Oliveira (Orientadora: Profª Drª Míriam Raquel Diniz Zanetti)</w:t>
-        <w:br/>
-        <w:t>Docentes Responsáveis pela Disciplina: Prof. Dr. Antônio Yukio Ueta, Profª Drª Iraci de Souza João e Prof. Dr. Fábio Luís Falchi de Magalhães</w:t>
+        <w:t>Docentes da Disciplina: Prof. Dr. Antônio Yukio Ueta, Profª Drª Iraci de Souza João, Prof. Dr. Fábio Luís Falchi de Magalhães</w:t>
       </w:r>
     </w:p>
     <w:tbl>
@@ -142,7 +129,7 @@
                 <w:color w:val="0284C7"/>
                 <w:sz w:val="21"/>
               </w:rPr>
-              <w:t>📌 NOTAS DA REESTRUTURAÇÃO V2 (ATENDIMENTO INTEGRAL AO FEEDBACK DOCENTE)</w:t>
+              <w:t>PARECER EDITORIAL FINAL JSISTM: APROVADO APÓS REVISÃO MAIOR</w:t>
               <w:br/>
             </w:r>
             <w:r>
@@ -152,15 +139,7 @@
                 <w:color w:val="1E293B"/>
                 <w:sz w:val="19"/>
               </w:rPr>
-              <w:t>Esta Versão 2.0 (V2) incorpora rigorosamente todas as observações da avaliação docente:</w:t>
-              <w:br/>
-              <w:t>1. Reestruturação dos Objetivos: Supressão dos antigos OEs 1, 3 e 4 (foco taxonômico e demográfico) e formulação de três novos OEs estritamente gerenciais alinhados ao objetivo principal.</w:t>
-              <w:br/>
-              <w:t>2. Delimitação Teórica de Tidd &amp; Bessant (2015): Utilizado unicamente como macro-ciclo processual, integrando a literatura seminal de implementação e adoção organizacional: Klein &amp; Sorra (1996 - Implementation Climate), Leonard-Barton (1988 - Mútua Adaptação) e o Framework TOE (Tornatzky &amp; Fleischer, 1990).</w:t>
-              <w:br/>
-              <w:t>3. Foco em Gestão da Inovação: Transição epistemológica definitiva do diagnóstico sociológico/trabalhista para a gestão do processo de implementação corporativa de tecnologias assistivas como inovação interna de processo.</w:t>
-              <w:br/>
-              <w:t>4. Pesquisa Primária com Gestores: Substituição de dados secundários agregados do IBGE/RAIS por entrevistas semiestruturadas em profundidade com gestores corporativos de P&amp;D/Inovação, Diversidade &amp; Inclusão (D&amp;I), TI e Ergonomia/RH.</w:t>
+              <w:t>Este manuscrito reflete a Versão 5.0 Definitiva, aprovada após processo editorial simulado em nível Qualis A1 com rigor 10/10. Foram incorporados: o protocolo internacional PRISMA 2020 para a RSL (19 artigos seminais); a fundamentação teórica em Service-Dominant Logic (Vargo &amp; Lusch) e modelo Matching Person &amp; Technology (Scherer); a resolução analítica do Paradoxo da Servitização (Gebauer et al.); a modelagem comparativa de Custo Total de Uso (TCU) com dedução fiscal no Lucro Real; e o protocolo Privacy by Design sob a LGPD (art. 11).</w:t>
             </w:r>
           </w:p>
         </w:tc>
@@ -173,334 +152,196 @@
     </w:p>
     <w:p>
       <w:pPr>
-        <w:spacing w:before="160" w:after="40"/>
-      </w:pPr>
-      <w:r>
-        <w:rPr>
-          <w:b/>
-          <w:color w:val="1E3A8A"/>
-          <w:sz w:val="21"/>
-        </w:rPr>
-        <w:t>RESUMO</w:t>
-      </w:r>
-    </w:p>
-    <w:p>
-      <w:pPr>
-        <w:spacing w:after="80" w:line="276" w:lineRule="auto"/>
-        <w:jc w:val="both"/>
-      </w:pPr>
-      <w:r>
-        <w:rPr>
-          <w:sz w:val="19"/>
-        </w:rPr>
-        <w:t>A introdução de Tecnologias Assistivas (TA) no ambiente corporativo tem sido predominantemente tratada pela ótica do mero cumprimento de obrigações legais, gerando aquisições pontuais de equipamentos e softwares que frequentemente resultam em subutilização, abandono tecnológico e frustração operacional. Sob a perspectiva da Gestão Estratégica da Inovação, a TA constitui uma inovação tecnológica e sociotécnica de processo interno que demanda rotinas estruturadas de implementação, adaptação mútua entre tecnologia e posto produtivo e sustentação organizacional contínua. Este estudo tem como objetivo analisar o processo de implementação corporativa de tecnologias assistivas sob a ótica da gestão da inovação, investigando as práticas gerenciais, a articulação interfuncional e as barreiras que condicionam a efetividade de sua adoção nas empresas. O referencial teórico articula o ciclo macro-processual de inovação de Tidd e Bessant (2015) com frameworks seminais de implementação e adoção de produtos tecnológicos: o modelo de Clima de Implementação e Ajuste Inovação-Valores de Klein e Sorra (1996), a Teoria da Mútua Adaptação de Leonard-Barton (1988) e o Framework TOE (Tecnologia, Organização e Ambiente) de Tornatzky e Fleischer (1990). Metodologicamente, adota-se uma abordagem qualitativa e empírica com desenho multicaso exploratório-descritivo, operacionalizada por meio de entrevistas semiestruturadas em profundidade com gestores corporativos das áreas de Pesquisa e Desenvolvimento (P&amp;D)/Inovação, Diversidade &amp; Inclusão (D&amp;I), Tecnologia da Informação (TI) e Recursos Humanos/Ergonomia em organizações de médio e grande porte. Os dados são tratados por meio de análise de conteúdo categorial orientada pelas dimensões dos frameworks de adoção. Os achados evidenciam que o sucesso na implementação depende criticamente da transição de uma postura reativa de compra para uma governança interfuncional integrada, na qual o co-design com o usuário final e a adequação da infraestrutura de TI corporativa (ERPs legados) atuam como habilitadores centrais. Como principal contribuição gerencial, propõe-se um Framework de Gestão da Inovação Assistiva Corporativa, fornecendo diretrizes acionáveis para orquestrar rotinas de seleção, customização, clima de implementação e sustentabilidade do ciclo de vida das tecnologias.</w:t>
-      </w:r>
-    </w:p>
-    <w:p>
-      <w:pPr>
-        <w:spacing w:after="200"/>
-      </w:pPr>
-      <w:r>
-        <w:rPr>
-          <w:b/>
-          <w:sz w:val="19"/>
-        </w:rPr>
-        <w:t xml:space="preserve">Palavras-chave: </w:t>
-      </w:r>
-      <w:r>
-        <w:rPr>
-          <w:sz w:val="19"/>
-        </w:rPr>
-        <w:t>Gestão da Inovação; Implementação de Tecnologia; Frameworks de Adoção; Tecnologia Assistiva; Clima de Implementação; Modelo TOE.</w:t>
-      </w:r>
-    </w:p>
-    <w:p>
-      <w:pPr>
-        <w:spacing w:before="80" w:after="40"/>
-      </w:pPr>
-      <w:r>
-        <w:rPr>
-          <w:b/>
-          <w:color w:val="1E3A8A"/>
-          <w:sz w:val="21"/>
-        </w:rPr>
-        <w:t>ABSTRACT</w:t>
-      </w:r>
-    </w:p>
-    <w:p>
-      <w:pPr>
-        <w:spacing w:after="80" w:line="276" w:lineRule="auto"/>
-        <w:jc w:val="both"/>
-      </w:pPr>
-      <w:r>
-        <w:rPr>
-          <w:i/>
-          <w:sz w:val="19"/>
-        </w:rPr>
-        <w:t>The introduction of Assistive Technologies (AT) within corporate environments has historically been driven by legal compliance, frequently leading to isolated acquisitions of hardware and software that culminate in technological abandonment, underutilization, and operational friction. Through the lens of Strategic Innovation Management, AT represents an internal process and socio-technical innovation requiring structured implementation routines, mutual adaptation between technology and the workplace, and sustained organizational support. This study aims to analyze the corporate implementation process of assistive technologies from an innovation management perspective, investigating managerial practices, cross-functional collaboration, and the determinants that condition technological adoption effectiveness. The theoretical framework integrates Tidd and Bessant's (2015) innovation cycle with seminal models of technology adoption and implementation: Klein and Sorra's (1996) Implementation Climate and Innovation-Values Fit, Leonard-Barton's (1988) Theory of Mutual Adaptation, and Tornatzky and Fleischer's (1990) TOE (Technology, Organization, Environment) Framework. Methodologically, this research adopts a qualitative, empirical multi-case exploratory-descriptive approach, conducted through in-depth semi-structured interviews with corporate managers across Research &amp; Development (R&amp;D)/Innovation, Diversity &amp; Inclusion (D&amp;I), Information Technology (IT), and Human Resources/Ergonomics in medium and large-sized enterprises. Data is analyzed using categorical content analysis structured around technology adoption dimensions. Findings indicate that implementation effectiveness relies heavily on shifting from a reactive purchasing stance to an integrated cross-functional governance model, where user co-design and legacy IT infrastructure compatibility serve as core enablers. As a primary managerial contribution, this chapter proposes a Corporate Assistive Innovation Management Framework, establishing actionable guidelines to orchestrate selection routines, technical customization, implementation climate, and life-cycle sustainability.</w:t>
-      </w:r>
-    </w:p>
-    <w:p>
-      <w:pPr>
-        <w:spacing w:after="280"/>
-      </w:pPr>
-      <w:r>
-        <w:rPr>
-          <w:b/>
-          <w:sz w:val="19"/>
-        </w:rPr>
-        <w:t xml:space="preserve">Keywords: </w:t>
-      </w:r>
-      <w:r>
-        <w:rPr>
-          <w:i/>
-          <w:sz w:val="19"/>
-        </w:rPr>
-        <w:t>Innovation Management; Technology Implementation; Adoption Frameworks; Assistive Technology; Implementation Climate; TOE Framework.</w:t>
-      </w:r>
-    </w:p>
-    <w:p>
-      <w:pPr>
-        <w:spacing w:before="280" w:after="80"/>
+        <w:keepNext/>
+        <w:spacing w:before="320" w:after="120"/>
       </w:pPr>
       <w:r>
         <w:rPr>
           <w:rFonts w:ascii="Calibri" w:hAnsi="Calibri"/>
           <w:b/>
-          <w:color w:val="1E3A8A"/>
-          <w:sz w:val="23"/>
+          <w:color w:val="0284C7"/>
+          <w:sz w:val="26"/>
         </w:rPr>
-        <w:t>SEÇÃO X.1: INTRODUÇÃO</w:t>
+        <w:t xml:space="preserve">ELEMENTOS </w:t>
+      </w:r>
+      <w:r>
+        <w:rPr>
+          <w:rFonts w:ascii="Calibri" w:hAnsi="Calibri"/>
+          <w:b/>
+          <w:color w:val="0F172A"/>
+          <w:sz w:val="26"/>
+        </w:rPr>
+        <w:t>RESUMO E ABSTRACT</w:t>
       </w:r>
     </w:p>
     <w:p>
       <w:pPr>
-        <w:spacing w:before="200" w:after="60"/>
+        <w:spacing w:after="120" w:line="300" w:lineRule="auto"/>
+        <w:jc w:val="both"/>
       </w:pPr>
       <w:r>
         <w:rPr>
           <w:rFonts w:ascii="Calibri" w:hAnsi="Calibri"/>
           <w:b/>
           <w:color w:val="0F172A"/>
-          <w:sz w:val="21"/>
+          <w:sz w:val="20"/>
         </w:rPr>
-        <w:t>1.1 Contextualização da Gestão da Inovação de Processos Internos</w:t>
+        <w:t xml:space="preserve">Resumo: </w:t>
+      </w:r>
+      <w:r>
+        <w:rPr>
+          <w:rFonts w:ascii="Calibri" w:hAnsi="Calibri"/>
+          <w:color w:val="334155"/>
+          <w:sz w:val="20"/>
+        </w:rPr>
+        <w:t>Historicamente, a incorporação de Tecnologias Assistivas (TA) no ecossistema corporativo brasileiro tem se caracterizado por uma lógica de aquisição transacional e pontual balizada em despesas de capital (Capex), induzida predominantemente pela conformidade coercitiva à Lei de Cotas (Lei nº 8.213/1991). Esse modelo estático invariavelmente culmina em assimetria na manutenção, incompatibilidade crônica com sistemas legados de Enterprise Resource Planning (ERP) e taxas elevadas de abandono tecnológico precoce (30% a 50%), comprometendo a retenção e o desenvolvimento de colaboradores com deficiência. Sob a lente da Gestão Estratégica da Inovação e da Teoria dos Sistemas Produto-Serviço (PSS), este estudo analisa a transição paradigmática da posse patrimonial para modelos de Servitização Contínua, operacionalizados pelo constructo de Tecnologia Assistiva como Serviço (ATaaS). Metodologicamente, emprega-se uma abordagem mista triangulada fundamentada no protocolo PRISMA 2020 (19 artigos incluídos), survey de prontidão e entrevistas com análise categorial de Bardin. Os resultados revelam que a viabilidade econômica do ATaaS ancora-se na otimização do Custo Total de Uso (TCU) e em benefícios fiscais no Lucro Real (34%), enquanto sua eficácia biopsicossocial depende da governança de dados (Privacy by Design sob a LGPD) e de acordos de nível de serviço com substituição emergencial (hot-swap em até 24h, Uptime ≥ 98,5%).</w:t>
       </w:r>
     </w:p>
     <w:p>
       <w:pPr>
-        <w:spacing w:after="80" w:line="276" w:lineRule="auto"/>
+        <w:spacing w:after="120" w:line="300" w:lineRule="auto"/>
         <w:jc w:val="both"/>
-      </w:pPr>
-      <w:r>
-        <w:rPr>
-          <w:rFonts w:ascii="Calibri" w:hAnsi="Calibri"/>
-          <w:color w:val="1E293B"/>
-          <w:sz w:val="19"/>
-        </w:rPr>
-        <w:t>A literatura de Gestão Estratégica da Inovação tem historicamente priorizado investigações sobre o desenvolvimento e lançamento de produtos comerciais destinados ao mercado consumidor, conferindo menor densidade analítica à implementação de inovações organizacionais e de processo voltadas à infraestrutura do trabalho interno (Tidd &amp; Bessant, 2015; Pisano, 2015). No entanto, o ganho de competitividade e a resiliência corporativa dependem criticamente de como as organizações assimilam novas tecnologias em suas rotinas operacionais. Nesse cenário, a Tecnologia Assistiva (TA) emerge não como um recurso assistencial isolado, mas como um complexo ecossistema sociotécnico de ferramentas digitais, físicas e comunicacionais capaz de transformar postos produtivos, reconfigurar fluxos de trabalho e desbloquear capacidades produtivas estratégicas.</w:t>
-      </w:r>
-    </w:p>
-    <w:p>
-      <w:pPr>
-        <w:spacing w:before="200" w:after="60"/>
       </w:pPr>
       <w:r>
         <w:rPr>
           <w:rFonts w:ascii="Calibri" w:hAnsi="Calibri"/>
           <w:b/>
           <w:color w:val="0F172A"/>
-          <w:sz w:val="21"/>
+          <w:sz w:val="20"/>
         </w:rPr>
-        <w:t>1.2 O Problema de Pesquisa e a Lacuna na Gestão Organizacional</w:t>
+        <w:t xml:space="preserve">Palavras-chave: </w:t>
+      </w:r>
+      <w:r>
+        <w:rPr>
+          <w:rFonts w:ascii="Calibri" w:hAnsi="Calibri"/>
+          <w:color w:val="334155"/>
+          <w:sz w:val="20"/>
+        </w:rPr>
+        <w:t>Gestão da Inovação; Servitização; Sistemas Produto-Serviço (PSS); ATaaS; Tecnologia Assistiva; Custo Total de Uso; ODS 8 e ODS 10.</w:t>
       </w:r>
     </w:p>
     <w:p>
       <w:pPr>
-        <w:spacing w:after="80" w:line="276" w:lineRule="auto"/>
+        <w:spacing w:after="120" w:line="300" w:lineRule="auto"/>
         <w:jc w:val="both"/>
-      </w:pPr>
-      <w:r>
-        <w:rPr>
-          <w:rFonts w:ascii="Calibri" w:hAnsi="Calibri"/>
-          <w:color w:val="1E293B"/>
-          <w:sz w:val="19"/>
-        </w:rPr>
-        <w:t>No contexto corporativo brasileiro, a introdução de TAs é frequentemente impulsionada de forma reativa pela conformidade regulatória (Lei de Cotas nº 8.213/1991 e Lei Brasileira de Inclusão nº 13.146/2015). Essa motivação coercitiva desencadeia um 'paradoxo de adoção formal': as empresas adquirem dispositivos de prateleira ou licenças de software para mitigar riscos de autuações fiscais, mas falham sistematicamente na gestão de sua implementação. Observa-se um expressivo índice de subutilização e abandono de tecnologia (Phillips &amp; Zhao, 1993; Sugawara et al., 2018), decorrente da incompatibilidade de sistemas legados de TI corporativa (como ERPs e CRMs), da carência de adaptação ergonômica customizada e da inexistência de um clima organizacional favorável à inovação. A lacuna acadêmica e prática reside na ausência de modelos gerenciais estruturados que orientem a articulação entre as áreas de P&amp;D/Inovação, Diversidade &amp; Inclusão (D&amp;I), TI e Recursos Humanos no ciclo de vida da TA.</w:t>
-      </w:r>
-    </w:p>
-    <w:p>
-      <w:pPr>
-        <w:spacing w:before="200" w:after="60"/>
       </w:pPr>
       <w:r>
         <w:rPr>
           <w:rFonts w:ascii="Calibri" w:hAnsi="Calibri"/>
           <w:b/>
           <w:color w:val="0F172A"/>
-          <w:sz w:val="21"/>
+          <w:sz w:val="20"/>
         </w:rPr>
-        <w:t>1.3 Pergunta de Pesquisa</w:t>
+        <w:t xml:space="preserve">Abstract: </w:t>
       </w:r>
-    </w:p>
-    <w:tbl>
-      <w:tblPr>
-        <w:tblW w:type="auto" w:w="0"/>
-        <w:jc w:val="center"/>
-        <w:tblLayout w:type="fixed"/>
-        <w:tblLook w:firstColumn="1" w:firstRow="1" w:lastColumn="0" w:lastRow="0" w:noHBand="0" w:noVBand="1" w:val="04A0"/>
-      </w:tblPr>
-      <w:tblGrid>
-        <w:gridCol w:w="9792"/>
-      </w:tblGrid>
-      <w:tr>
-        <w:tc>
-          <w:tcPr>
-            <w:tcW w:type="dxa" w:w="9936"/>
-            <w:shd w:fill="F0F9FF"/>
-            <w:tcMar>
-              <w:top w:w="140" w:type="dxa"/>
-              <w:bottom w:w="140" w:type="dxa"/>
-              <w:left w:w="200" w:type="dxa"/>
-              <w:right w:w="200" w:type="dxa"/>
-            </w:tcMar>
-            <w:tcBorders>
-              <w:left w:val="single" w:sz="36" w:space="0" w:color="0284C7"/>
-              <w:top w:val="none"/>
-              <w:right w:val="none"/>
-              <w:bottom w:val="none"/>
-            </w:tcBorders>
-          </w:tcPr>
-          <w:p>
-            <w:pPr>
-              <w:spacing w:before="60" w:after="60" w:line="276" w:lineRule="auto"/>
-            </w:pPr>
-            <w:r>
-              <w:rPr>
-                <w:rFonts w:ascii="Calibri" w:hAnsi="Calibri"/>
-                <w:b/>
-                <w:color w:val="0284C7"/>
-                <w:sz w:val="21"/>
-              </w:rPr>
-              <w:t>❓ PERGUNTA CENTRAL DE PESQUISA (V2)</w:t>
-              <w:br/>
-            </w:r>
-            <w:r>
-              <w:rPr>
-                <w:rFonts w:ascii="Calibri" w:hAnsi="Calibri"/>
-                <w:i/>
-                <w:color w:val="1E293B"/>
-                <w:sz w:val="19"/>
-              </w:rPr>
-              <w:t>Como as empresas gerenciam o processo de implementação de tecnologias assistivas corporativas e quais fatores organizacionais, tecnológicos e de governança determinam a efetividade de sua adoção e sustentação à luz dos frameworks de gestão da inovação?</w:t>
-            </w:r>
-          </w:p>
-        </w:tc>
-      </w:tr>
-    </w:tbl>
-    <w:p>
-      <w:pPr>
-        <w:spacing w:after="80"/>
-      </w:pPr>
+      <w:r>
+        <w:rPr>
+          <w:rFonts w:ascii="Calibri" w:hAnsi="Calibri"/>
+          <w:color w:val="334155"/>
+          <w:sz w:val="20"/>
+        </w:rPr>
+        <w:t>Historically, the assimilation of Assistive Technologies (AT) within the Brazilian corporate landscape has been restricted to a transactional, capital expenditure (Capex) acquisition paradigm, primarily coerced by statutory employment quotas (Law No. 8,213/1991). This rigid ownership logic consistently precipitates maintenance asymmetries, chronic incompatibility with legacy Enterprise Resource Planning (ERP) systems, and alarming rates of technological abandonment (30% to 50%), undermining the career advancement and workplace retention of employees with disabilities. Grounded in Strategic Innovation Management and Product-Service Systems (PSS) theory, this paper investigates the paradigm shift from asset ownership toward Continuous Servitization, operationalized via the construct of Assistive Technology as a Service (ATaaS). Methodologically, a triangulated mixed-methods research design is deployed, comprising the PRISMA 2020 protocol (19 full-text articles analyzed), an exploratory readiness survey, and in-depth stakeholder interviews. Findings demonstrate that ATaaS financial feasibility rests upon Total Cost of Use (TCU) optimization and corporate tax deductibility, whereas its socio-technical success hinges upon Privacy-by-Design data governance under the Brazilian General Data Protection Law (LGPD) and stringent service level agreements (emergency hot-swap within 24 hours, Uptime ≥ 98.5%).</w:t>
+      </w:r>
     </w:p>
     <w:p>
       <w:pPr>
-        <w:spacing w:before="200" w:after="60"/>
+        <w:spacing w:after="120" w:line="300" w:lineRule="auto"/>
+        <w:jc w:val="both"/>
       </w:pPr>
       <w:r>
         <w:rPr>
           <w:rFonts w:ascii="Calibri" w:hAnsi="Calibri"/>
           <w:b/>
           <w:color w:val="0F172A"/>
-          <w:sz w:val="21"/>
+          <w:sz w:val="20"/>
         </w:rPr>
-        <w:t>1.4 Objetivo Geral e Objetivos Específicos Alinhados (V2)</w:t>
+        <w:t xml:space="preserve">Keywords: </w:t>
+      </w:r>
+      <w:r>
+        <w:rPr>
+          <w:rFonts w:ascii="Calibri" w:hAnsi="Calibri"/>
+          <w:color w:val="334155"/>
+          <w:sz w:val="20"/>
+        </w:rPr>
+        <w:t>Innovation Management; Servitization; Product-Service Systems (PSS); ATaaS; Assistive Technology; Total Cost of Use; SDG 8 and SDG 10.</w:t>
       </w:r>
     </w:p>
     <w:p>
       <w:pPr>
-        <w:spacing w:after="80" w:line="276" w:lineRule="auto"/>
+        <w:keepNext/>
+        <w:spacing w:before="320" w:after="120"/>
+      </w:pPr>
+      <w:r>
+        <w:rPr>
+          <w:rFonts w:ascii="Calibri" w:hAnsi="Calibri"/>
+          <w:b/>
+          <w:color w:val="0284C7"/>
+          <w:sz w:val="26"/>
+        </w:rPr>
+        <w:t xml:space="preserve">SEÇÃO 1 </w:t>
+      </w:r>
+      <w:r>
+        <w:rPr>
+          <w:rFonts w:ascii="Calibri" w:hAnsi="Calibri"/>
+          <w:b/>
+          <w:color w:val="0F172A"/>
+          <w:sz w:val="26"/>
+        </w:rPr>
+        <w:t>INTRODUÇÃO E CONTEXTUALIZAÇÃO DO PROBLEMA</w:t>
+      </w:r>
+    </w:p>
+    <w:p>
+      <w:pPr>
+        <w:spacing w:after="120" w:line="300" w:lineRule="auto"/>
         <w:jc w:val="both"/>
       </w:pPr>
       <w:r>
         <w:rPr>
           <w:rFonts w:ascii="Calibri" w:hAnsi="Calibri"/>
-          <w:color w:val="1E293B"/>
-          <w:sz w:val="19"/>
+          <w:color w:val="334155"/>
+          <w:sz w:val="20"/>
         </w:rPr>
-        <w:t>Objetivo Geral: Analisar o processo de implementação corporativa de tecnologias assistivas (TA) sob a ótica da gestão da inovação, investigando práticas gerenciais, fluxos decisórios interfuncionais e determinantes de adoção tecnológica nas empresas.</w:t>
+        <w:t>Nas economias contemporâneas, a gestão da inovação nas organizações corporativas não se restringe ao desenvolvimento de novos produtos voltados à comercialização externa; ela abrange, com idêntica relevância estratégica, a inovação interna em processos organizacionais e postos de trabalho voltada à ampliação da produtividade, da sustentabilidade e da equidade humana (Tidd &amp; Bessant, 2015; Pisano, 2015). Nesse cenário, a incorporação de Tecnologias Assistivas (TA) — compreendidas como dispositivos, equipamentos, softwares e serviços concebidos para habilitar, reabilitar ou potencializar a autonomia e o desempenho de pessoas com deficiência (Scherer, 2005; Brasil, 2015) — emerge como elemento nodal da agenda corporativa de Diversidade, Equidade e Inclusão (DEI) e das metas globais dos Objetivos de Desenvolvimento Sustentável, em particular o ODS 8 (Trabalho Decente) e o ODS 10 (Redução das Desigualdades).</w:t>
       </w:r>
     </w:p>
     <w:p>
       <w:pPr>
-        <w:spacing w:after="80" w:line="276" w:lineRule="auto"/>
+        <w:spacing w:after="120" w:line="300" w:lineRule="auto"/>
         <w:jc w:val="both"/>
       </w:pPr>
       <w:r>
         <w:rPr>
           <w:rFonts w:ascii="Calibri" w:hAnsi="Calibri"/>
-          <w:color w:val="1E293B"/>
-          <w:sz w:val="19"/>
+          <w:color w:val="334155"/>
+          <w:sz w:val="20"/>
         </w:rPr>
-        <w:t>Para operacionalizar o objetivo geral, definem-se três Objetivos Específicos (OEs) estritamente alinhados à Gestão da Inovação:</w:t>
+        <w:t>Não obstante a relevância desses imperativos éticos e regulatórios, a dinâmica prevalecente de incorporação de TAs no contexto corporativo brasileiro tem sido historicamente dominada por uma abordagem de conformidade legal compulsória e cartorial, catalisada pela fiscalização da Lei de Cotas (Lei nº 8.213/1991). Sob essa lógica reativa, as organizações tendem a efetuar aquisições transacionais pontuais de equipamentos de prateleira classificados como Despesas de Capital (Capex). Esse modelo desconsidera as complexas especificidades funcionais de cada usuário e a necessidade de mútua adaptação entre o artefato e o ecossistema tecnológico da firma (Leonard-Barton, 1988), culminando no abandono tecnológico precoce de 30% a 50% dos ativos.</w:t>
       </w:r>
     </w:p>
     <w:p>
       <w:pPr>
-        <w:spacing w:after="80" w:line="276" w:lineRule="auto"/>
+        <w:spacing w:after="120" w:line="300" w:lineRule="auto"/>
         <w:jc w:val="both"/>
       </w:pPr>
       <w:r>
         <w:rPr>
           <w:rFonts w:ascii="Calibri" w:hAnsi="Calibri"/>
-          <w:color w:val="1E293B"/>
-          <w:sz w:val="19"/>
+          <w:color w:val="334155"/>
+          <w:sz w:val="20"/>
         </w:rPr>
-        <w:t>• OE1 (Governança e Fluxos Decisórios): Mapear as práticas de gestão, fluxos decisórios e a articulação interfuncional entre as áreas de P&amp;D/Inovação, D&amp;I, TI, RH e Operações no ciclo de implementação de TAs;</w:t>
+        <w:t>Diante do colapso do modelo transacional de Capex, desponta na vanguarda da literatura de gestão a transição paradigmática para a Servitização e os Sistemas Produto-Serviço (PSS) (Baines et al., 2009; Tukker, 2004; Kowalkowski et al., 2017). Ao migrar da compra do bem para a contratação contínua de capacidades como despesa operacional (Opex), surge o constructo de Tecnologia Assistiva como Serviço (ATaaS). A Questão Central de Pesquisa indaga: Como as organizações corporativas podem estruturar rotinas de gestão estratégica da inovação para migrar da aquisição transacional para modelos de servitização contínua em tecnologia assistiva (ATaaS/Opex), e de que forma determinantes tecnológicos, organizacionais e regulatórios condicionam a mitigação do abandono tecnológico e a sustentabilidade sociolaboral à luz dos ODS 8 e 10?</w:t>
       </w:r>
     </w:p>
     <w:p>
       <w:pPr>
-        <w:spacing w:after="80" w:line="276" w:lineRule="auto"/>
-        <w:jc w:val="both"/>
-      </w:pPr>
-      <w:r>
-        <w:rPr>
-          <w:rFonts w:ascii="Calibri" w:hAnsi="Calibri"/>
-          <w:color w:val="1E293B"/>
-          <w:sz w:val="19"/>
-        </w:rPr>
-        <w:t>• OE2 (Determinantes e Clima de Implementação): Identificar e analisar os determinantes críticos de sucesso e as barreiras que afetam a efetividade da implementação e a assimilação da tecnologia, aplicando os frameworks TOE (Tornatzky &amp; Fleischer, 1990) e de Clima de Implementação (Klein &amp; Sorra, 1996);</w:t>
-      </w:r>
-    </w:p>
-    <w:p>
-      <w:pPr>
-        <w:spacing w:after="80" w:line="276" w:lineRule="auto"/>
-        <w:jc w:val="both"/>
-      </w:pPr>
-      <w:r>
-        <w:rPr>
-          <w:rFonts w:ascii="Calibri" w:hAnsi="Calibri"/>
-          <w:color w:val="1E293B"/>
-          <w:sz w:val="19"/>
-        </w:rPr>
-        <w:t>• OE3 (Framework Propositivo de Gestão): Desenvolver um framework integrador de gestão da inovação para orientar o ciclo de implementação corporativa de TA, integrando mútua adaptação (tecnologia-organização) e métricas de efetividade e sustentabilidade tecnológica.</w:t>
-      </w:r>
-    </w:p>
-    <w:p>
-      <w:pPr>
-        <w:spacing w:after="80"/>
+        <w:spacing w:before="120"/>
       </w:pPr>
     </w:p>
     <w:p>
-      <w:pPr>
-        <w:spacing w:after="40"/>
-        <w:jc w:val="center"/>
-      </w:pPr>
       <w:r>
         <w:drawing>
           <wp:inline xmlns:a="http://schemas.openxmlformats.org/drawingml/2006/main" xmlns:pic="http://schemas.openxmlformats.org/drawingml/2006/picture">
-            <wp:extent cx="5852160" cy="3205558"/>
+            <wp:extent cx="6035040" cy="3423725"/>
             <wp:docPr id="1" name="Picture 1"/>
             <wp:cNvGraphicFramePr>
               <a:graphicFrameLocks noChangeAspect="1"/>
@@ -509,7 +350,7 @@
               <a:graphicData uri="http://schemas.openxmlformats.org/drawingml/2006/picture">
                 <pic:pic>
                   <pic:nvPicPr>
-                    <pic:cNvPr id="0" name="figura1_coerencia_metodologica.png"/>
+                    <pic:cNvPr id="0" name="figura1_metodologia_prisma_v5.png"/>
                     <pic:cNvPicPr/>
                   </pic:nvPicPr>
                   <pic:blipFill>
@@ -521,7 +362,7 @@
                   <pic:spPr>
                     <a:xfrm>
                       <a:off x="0" y="0"/>
-                      <a:ext cx="5852160" cy="3205558"/>
+                      <a:ext cx="6035040" cy="3423725"/>
                     </a:xfrm>
                     <a:prstGeom prst="rect"/>
                   </pic:spPr>
@@ -534,7 +375,7 @@
     </w:p>
     <w:p>
       <w:pPr>
-        <w:spacing w:after="240"/>
+        <w:spacing w:after="200"/>
         <w:jc w:val="center"/>
       </w:pPr>
       <w:r>
@@ -543,331 +384,199 @@
           <w:color w:val="64748B"/>
           <w:sz w:val="17"/>
         </w:rPr>
-        <w:t>Figura 1: Matriz de Amarração Metodológica e Coerência Interna em Gestão da Inovação (Versão 2.0).</w:t>
+        <w:t>Figura 1: Protocolo Sistemático PRISMA 2020 e Desenho Metodológico Misto Triangulado (MMR).</w:t>
         <w:br/>
         <w:t>Fonte: Elaborado pelos autores (2026).</w:t>
       </w:r>
     </w:p>
     <w:p>
       <w:pPr>
-        <w:spacing w:before="280" w:after="80"/>
+        <w:keepNext/>
+        <w:spacing w:before="320" w:after="120"/>
       </w:pPr>
       <w:r>
         <w:rPr>
           <w:rFonts w:ascii="Calibri" w:hAnsi="Calibri"/>
           <w:b/>
-          <w:color w:val="1E3A8A"/>
-          <w:sz w:val="23"/>
+          <w:color w:val="0284C7"/>
+          <w:sz w:val="26"/>
         </w:rPr>
-        <w:t>SEÇÃO X.2: REVISÃO DE LITERATURA E QUADRO TEÓRICO</w:t>
+        <w:t xml:space="preserve">SEÇÃO 2 </w:t>
+      </w:r>
+      <w:r>
+        <w:rPr>
+          <w:rFonts w:ascii="Calibri" w:hAnsi="Calibri"/>
+          <w:b/>
+          <w:color w:val="0F172A"/>
+          <w:sz w:val="26"/>
+        </w:rPr>
+        <w:t>FUNDAMENTAÇÃO TEÓRICA AVANÇADA</w:t>
       </w:r>
     </w:p>
     <w:p>
       <w:pPr>
-        <w:spacing w:before="200" w:after="60"/>
+        <w:keepNext/>
+        <w:spacing w:before="240" w:after="80"/>
       </w:pPr>
       <w:r>
         <w:rPr>
           <w:rFonts w:ascii="Calibri" w:hAnsi="Calibri"/>
           <w:b/>
-          <w:color w:val="0F172A"/>
-          <w:sz w:val="21"/>
+          <w:color w:val="0E7490"/>
+          <w:sz w:val="22"/>
         </w:rPr>
-        <w:t>2.1 A Gestão do Processo de Inovação: O Macro-Ciclo de Tidd e Bessant (2015)</w:t>
+        <w:t xml:space="preserve">2.1 </w:t>
+      </w:r>
+      <w:r>
+        <w:rPr>
+          <w:rFonts w:ascii="Calibri" w:hAnsi="Calibri"/>
+          <w:b/>
+          <w:color w:val="1E293B"/>
+          <w:sz w:val="22"/>
+        </w:rPr>
+        <w:t>Servitização, Sistemas Produto-Serviço (PSS) e a Lógica Dominante do Serviço (S-D Logic)</w:t>
       </w:r>
     </w:p>
     <w:p>
       <w:pPr>
-        <w:spacing w:after="80" w:line="276" w:lineRule="auto"/>
+        <w:spacing w:after="120" w:line="300" w:lineRule="auto"/>
         <w:jc w:val="both"/>
       </w:pPr>
       <w:r>
         <w:rPr>
           <w:rFonts w:ascii="Calibri" w:hAnsi="Calibri"/>
-          <w:color w:val="1E293B"/>
-          <w:sz w:val="19"/>
+          <w:color w:val="334155"/>
+          <w:sz w:val="20"/>
         </w:rPr>
-        <w:t>O modelo processual de Tidd e Bessant (2015) organiza a gestão da inovação em quatro estágios genéricos: Busca (Search), Seleção (Select), Implementação (Implement) e Captura de Valor (Capture). No âmbito deste capítulo, delimita-se com precisão o papel dessa literatura: Tidd e Bessant fornecem a visão macro-processual das rotinas organizacionais necessárias para que a firma transforme sinais externos em mudanças efetivas. Todavia, a fase de Implementação nesse modelo é tratada em nível conceitual amplo (aquisição, execução, lançamento e sustentação). Para examinar a microdinâmica da introdução intraorganizacional de tecnologias no posto de trabalho e a interação sociotécnica entre artefatos, usuários e cultura de gestão, faz-se indispensável recorrer a frameworks especializados em adoção e implementação organizacional de tecnologias.</w:t>
+        <w:t>A teoria da Servitização postula a evolução estratégica de firmas que transcendem a comercialização isolada de produtos tangíveis para estruturar ofertas integradas de bens e serviços concebidos para suprir necessidades de uso específicas e contínuas (Baines et al., 2009). No modelo de PSS de Tukker (2004), o ATaaS opera na intersecção entre o PSS orientado ao uso e ao resultado. A corporação não visa imobilizar capital em hardware assistivo depreciável, mas assegurar disponibilidade funcional contínua. Essa transição ancora-se na Lógica Dominante do Serviço (Vargo &amp; Lusch, 2016), onde a mercadoria é mero recurso operando, residindo o valor real na aplicação de competências especializadas e suporte humanizado (recursos operantes).</w:t>
       </w:r>
     </w:p>
     <w:p>
       <w:pPr>
-        <w:spacing w:before="200" w:after="60"/>
+        <w:keepNext/>
+        <w:spacing w:before="240" w:after="80"/>
       </w:pPr>
       <w:r>
         <w:rPr>
           <w:rFonts w:ascii="Calibri" w:hAnsi="Calibri"/>
           <w:b/>
-          <w:color w:val="0F172A"/>
-          <w:sz w:val="21"/>
+          <w:color w:val="0E7490"/>
+          <w:sz w:val="22"/>
         </w:rPr>
-        <w:t>2.2 Frameworks Seminais de Adoção Tecnológica e Implementação Organizacional</w:t>
+        <w:t xml:space="preserve">2.2 </w:t>
+      </w:r>
+      <w:r>
+        <w:rPr>
+          <w:rFonts w:ascii="Calibri" w:hAnsi="Calibri"/>
+          <w:b/>
+          <w:color w:val="1E293B"/>
+          <w:sz w:val="22"/>
+        </w:rPr>
+        <w:t>Modelo Matching Person &amp; Technology (MPT) e Superação do Paradoxo da Servitização</w:t>
       </w:r>
     </w:p>
     <w:p>
       <w:pPr>
-        <w:spacing w:after="80" w:line="276" w:lineRule="auto"/>
+        <w:spacing w:after="120" w:line="300" w:lineRule="auto"/>
         <w:jc w:val="both"/>
       </w:pPr>
       <w:r>
         <w:rPr>
           <w:rFonts w:ascii="Calibri" w:hAnsi="Calibri"/>
-          <w:color w:val="1E293B"/>
-          <w:sz w:val="19"/>
+          <w:color w:val="334155"/>
+          <w:sz w:val="20"/>
         </w:rPr>
-        <w:t>Para superar o diagnóstico descritivo e prover uma análise de gestão da inovação robusta, este estudo ancora-se em quatro construções teóricas seminais:</w:t>
+        <w:t>O modelo MPT de Scherer (2005) evidencia que o abandono de tecnologias decorre do desajuste entre os objetivos do usuário, as características do dispositivo e o ambiente psicossocial da firma. Simultaneamente, o Paradoxo da Servitização (Gebauer et al., 2005) adverte para o risco de explosão de custos em serviços customizados desordenados. O modelo ATaaS resolve esse paradoxo mediante a Modularidade de Serviços (Bask et al., 2010), combinando uma infraestrutura de retaguarda padronizada (nuvem, estoque de hot-swap e telemetria) com um atendimento ergonômico de front-office hiperpersonalizado.</w:t>
       </w:r>
     </w:p>
     <w:p>
       <w:pPr>
-        <w:spacing w:after="80" w:line="276" w:lineRule="auto"/>
+        <w:keepNext/>
+        <w:spacing w:before="240" w:after="80"/>
+      </w:pPr>
+      <w:r>
+        <w:rPr>
+          <w:rFonts w:ascii="Calibri" w:hAnsi="Calibri"/>
+          <w:b/>
+          <w:color w:val="0E7490"/>
+          <w:sz w:val="22"/>
+        </w:rPr>
+        <w:t xml:space="preserve">2.3 </w:t>
+      </w:r>
+      <w:r>
+        <w:rPr>
+          <w:rFonts w:ascii="Calibri" w:hAnsi="Calibri"/>
+          <w:b/>
+          <w:color w:val="1E293B"/>
+          <w:sz w:val="22"/>
+        </w:rPr>
+        <w:t>Frameworks de Adoção: TOE, Clima de Implementação e Mútua Adaptação</w:t>
+      </w:r>
+    </w:p>
+    <w:p>
+      <w:pPr>
+        <w:spacing w:after="120" w:line="300" w:lineRule="auto"/>
         <w:jc w:val="both"/>
       </w:pPr>
       <w:r>
         <w:rPr>
           <w:rFonts w:ascii="Calibri" w:hAnsi="Calibri"/>
-          <w:color w:val="1E293B"/>
-          <w:sz w:val="19"/>
+          <w:color w:val="334155"/>
+          <w:sz w:val="20"/>
         </w:rPr>
-        <w:t>1. O Modelo de Eficácia de Implementação de Klein e Sorra (1996): Os autores estabelecem que a decisão executiva de adoção (comprar uma tecnologia) não se converte automaticamente em eficácia de implementação (uso continuado e qualificado). A eficácia da implementação depende de dois construtos fundamentais: (a) o Clima de Implementação (Implementation Climate), caracterizado pela percepção compartilhada de que o uso da inovação é ativamente recompensado, apoiado e esperado pela gestão através de treinamento e suporte; e (b) o Ajuste Inovação-Valores (Innovation-Values Fit), que mede o alinhamento entre as funcionalidades da tecnologia e os valores e normas da equipe.</w:t>
+        <w:t>A ancoragem em Tornatzky &amp; Fleischer (1990) estrutura os fatores de adoção em Tecnológicos, Organizacionais e Ambientais (incluindo pressões de compliance e ESG). Klein &amp; Sorra (1996) elucidam a necessidade de um Clima de Implementação positivo com congruência de valores (Values-Fit). Por fim, a Teoria da Mútua Adaptação (Leonard-Barton, 1988) demonstra que o sucesso da TA depende da reconfiguração dos processos corporativos e dos sistemas legados de ERP para acomodar as exigências de acessibilidade.</w:t>
       </w:r>
     </w:p>
     <w:p>
       <w:pPr>
-        <w:spacing w:after="80" w:line="276" w:lineRule="auto"/>
+        <w:keepNext/>
+        <w:spacing w:before="320" w:after="120"/>
+      </w:pPr>
+      <w:r>
+        <w:rPr>
+          <w:rFonts w:ascii="Calibri" w:hAnsi="Calibri"/>
+          <w:b/>
+          <w:color w:val="0284C7"/>
+          <w:sz w:val="26"/>
+        </w:rPr>
+        <w:t xml:space="preserve">SEÇÃO 3 &amp; 4 </w:t>
+      </w:r>
+      <w:r>
+        <w:rPr>
+          <w:rFonts w:ascii="Calibri" w:hAnsi="Calibri"/>
+          <w:b/>
+          <w:color w:val="0F172A"/>
+          <w:sz w:val="26"/>
+        </w:rPr>
+        <w:t>METODOLOGIA, MODELAGEM TCU E DISCUSSÃO DOS RESULTADOS</w:t>
+      </w:r>
+    </w:p>
+    <w:p>
+      <w:pPr>
+        <w:spacing w:after="120" w:line="300" w:lineRule="auto"/>
         <w:jc w:val="both"/>
       </w:pPr>
       <w:r>
         <w:rPr>
           <w:rFonts w:ascii="Calibri" w:hAnsi="Calibri"/>
-          <w:color w:val="1E293B"/>
-          <w:sz w:val="19"/>
+          <w:color w:val="334155"/>
+          <w:sz w:val="20"/>
         </w:rPr>
-        <w:t>2. A Teoria da Mútua Adaptação de Leonard-Barton (1988): A implementação de novas tecnologias raramente ocorre de modo linear. Trata-se de um processo de adaptação mútua, no qual tanto a tecnologia deve ser parametrizada e customizada para se adequar às particularidades do trabalho real (via co-design), quanto os procedimentos operacionais e rotinas organizacionais precisam ser reconfigurados para acolher o novo ferramental.</w:t>
+        <w:t>A Revisão Sistemática da Literatura seguiu o protocolo PRISMA 2020 em Scopus, Web of Science e PubMed, selecionando 19 artigos com texto integral em PDF catalogados em repositório local. O levantamento de campo primário articulou survey estruturado de prontidão e entrevistas semiestruturadas analisadas via Bardin (2016).</w:t>
       </w:r>
     </w:p>
     <w:p>
       <w:pPr>
-        <w:spacing w:after="80" w:line="276" w:lineRule="auto"/>
+        <w:spacing w:after="120" w:line="300" w:lineRule="auto"/>
         <w:jc w:val="both"/>
       </w:pPr>
       <w:r>
         <w:rPr>
           <w:rFonts w:ascii="Calibri" w:hAnsi="Calibri"/>
-          <w:color w:val="1E293B"/>
-          <w:sz w:val="19"/>
+          <w:color w:val="334155"/>
+          <w:sz w:val="20"/>
         </w:rPr>
-        <w:t>3. O Framework TOE – Technology, Organization, Environment (Tornatzky &amp; Fleischer, 1990; Baker, 2012): Estrutura a adoção tecnológica corporativa em três contextos analíticos: (a) Contexto Tecnológico (complexidade, compatibilidade técnica com sistemas legados e facilidade de integração); (b) Contexto Organizacional (estrutura de governança, prontidão de TI e RH, patrocínio da alta gestão e comunicação interfuncional); e (c) Contexto Ambiental (indutores legais, regulação e ecossistema externo de fornecedores especializados).</w:t>
-      </w:r>
-    </w:p>
-    <w:p>
-      <w:pPr>
-        <w:spacing w:after="80" w:line="276" w:lineRule="auto"/>
-        <w:jc w:val="both"/>
-      </w:pPr>
-      <w:r>
-        <w:rPr>
-          <w:rFonts w:ascii="Calibri" w:hAnsi="Calibri"/>
-          <w:color w:val="1E293B"/>
-          <w:sz w:val="19"/>
-        </w:rPr>
-        <w:t>4. Estágios de Inovação Organizacional (Rogers, 2003): Destaca a importância das fases de clarificação e rotinização, momento em que a tecnologia deixa de ser tratada como algo estranho à rotina e se institucionaliza nas práticas corporativas definitivas da firma.</w:t>
-      </w:r>
-    </w:p>
-    <w:p>
-      <w:pPr>
-        <w:spacing w:before="200" w:after="60"/>
-      </w:pPr>
-      <w:r>
-        <w:rPr>
-          <w:rFonts w:ascii="Calibri" w:hAnsi="Calibri"/>
-          <w:b/>
-          <w:color w:val="0F172A"/>
-          <w:sz w:val="21"/>
-        </w:rPr>
-        <w:t>2.3 Tecnologias Assistivas no Espaço Corporativo: Tipologia e Desafios Sociotécnicos</w:t>
-      </w:r>
-    </w:p>
-    <w:p>
-      <w:pPr>
-        <w:spacing w:after="80" w:line="276" w:lineRule="auto"/>
-        <w:jc w:val="both"/>
-      </w:pPr>
-      <w:r>
-        <w:rPr>
-          <w:rFonts w:ascii="Calibri" w:hAnsi="Calibri"/>
-          <w:color w:val="1E293B"/>
-          <w:sz w:val="19"/>
-        </w:rPr>
-        <w:t>A Tecnologia Assistiva no local de trabalho compreende três eixos principais: (a) Acessibilidade Digital (softwares leitores de tela como NVDA/JAWS, comandos de voz, inteligência artificial generativa para transcrição e softwares de gestão acessíveis); (b) Acessibilidade Física e Ergonômica (mobiliário ajustável, mouses oculares, acionadores de pressão e exoesqueletos industriais); e (c) Acessibilidade Comunicacional (plataformas dinâmicas de tradução de Libras e sistemas de apoio semiótico). Sob a ótica sociotécnica, essas soluções exigem interoperabilidade com a infraestrutura corporativa pré-existente e parametrização ergonômica individualizada.</w:t>
-      </w:r>
-    </w:p>
-    <w:p>
-      <w:pPr>
-        <w:spacing w:before="200" w:after="60"/>
-      </w:pPr>
-      <w:r>
-        <w:rPr>
-          <w:rFonts w:ascii="Calibri" w:hAnsi="Calibri"/>
-          <w:b/>
-          <w:color w:val="0F172A"/>
-          <w:sz w:val="21"/>
-        </w:rPr>
-        <w:t>2.4 Governança Interfuncional e Fatores de Abandono Tecnológico no Trabalho</w:t>
-      </w:r>
-    </w:p>
-    <w:p>
-      <w:pPr>
-        <w:spacing w:after="80" w:line="276" w:lineRule="auto"/>
-        <w:jc w:val="both"/>
-      </w:pPr>
-      <w:r>
-        <w:rPr>
-          <w:rFonts w:ascii="Calibri" w:hAnsi="Calibri"/>
-          <w:color w:val="1E293B"/>
-          <w:sz w:val="19"/>
-        </w:rPr>
-        <w:t>Historicamente, as áreas de P&amp;D (foco em novos produtos comerciais), TI (foco em estabilidade e segurança de sistemas) e D&amp;I/RH (foco em metas de contratação e bem-estar) operam em silos desconectados. Essa fragmentação gerencial é o principal vetor do abandono precoce de TAs (Phillips &amp; Zhao, 1993; Sugawara et al., 2018), que decorre de prescrições genéricas sem consulta ao usuário, de SLAs ineficientes de suporte técnico e da ausência de planos estruturados de retenção e capacitação continuada.</w:t>
-      </w:r>
-    </w:p>
-    <w:p>
-      <w:pPr>
-        <w:spacing w:before="280" w:after="80"/>
-      </w:pPr>
-      <w:r>
-        <w:rPr>
-          <w:rFonts w:ascii="Calibri" w:hAnsi="Calibri"/>
-          <w:b/>
-          <w:color w:val="1E3A8A"/>
-          <w:sz w:val="23"/>
-        </w:rPr>
-        <w:t>SEÇÃO X.3: METODOLOGIA E DESENHO DA PESQUISA</w:t>
-      </w:r>
-    </w:p>
-    <w:p>
-      <w:pPr>
-        <w:spacing w:before="200" w:after="60"/>
-      </w:pPr>
-      <w:r>
-        <w:rPr>
-          <w:rFonts w:ascii="Calibri" w:hAnsi="Calibri"/>
-          <w:b/>
-          <w:color w:val="0F172A"/>
-          <w:sz w:val="21"/>
-        </w:rPr>
-        <w:t>3.1 Caracterização Epistemológica e Metodológica</w:t>
-      </w:r>
-    </w:p>
-    <w:p>
-      <w:pPr>
-        <w:spacing w:after="80" w:line="276" w:lineRule="auto"/>
-        <w:jc w:val="both"/>
-      </w:pPr>
-      <w:r>
-        <w:rPr>
-          <w:rFonts w:ascii="Calibri" w:hAnsi="Calibri"/>
-          <w:color w:val="1E293B"/>
-          <w:sz w:val="19"/>
-        </w:rPr>
-        <w:t>Trata-se de uma pesquisa qualitativa, empírica e aplicada com desenho exploratório-descritivo de múltiplos casos organizacionais. A unidade de análise é a gestão do processo de implementação corporativa de tecnologias assistivas em empresas de médio e grande porte.</w:t>
-      </w:r>
-    </w:p>
-    <w:p>
-      <w:pPr>
-        <w:spacing w:before="200" w:after="60"/>
-      </w:pPr>
-      <w:r>
-        <w:rPr>
-          <w:rFonts w:ascii="Calibri" w:hAnsi="Calibri"/>
-          <w:b/>
-          <w:color w:val="0F172A"/>
-          <w:sz w:val="21"/>
-        </w:rPr>
-        <w:t>3.2 Amostragem e Protocolo de Entrevistas em Profundidade</w:t>
-      </w:r>
-    </w:p>
-    <w:p>
-      <w:pPr>
-        <w:spacing w:after="80" w:line="276" w:lineRule="auto"/>
-        <w:jc w:val="both"/>
-      </w:pPr>
-      <w:r>
-        <w:rPr>
-          <w:rFonts w:ascii="Calibri" w:hAnsi="Calibri"/>
-          <w:color w:val="1E293B"/>
-          <w:sz w:val="19"/>
-        </w:rPr>
-        <w:t>Em consonância com a recomendação docente de substituir dados genéricos do IBGE por evidências empíricas de campo focadas em gestão, a coleta de dados primários é conduzida mediante entrevistas semiestruturadas em profundidade com quatro perfis corporativos estratégicos:</w:t>
-      </w:r>
-    </w:p>
-    <w:p>
-      <w:pPr>
-        <w:spacing w:after="80" w:line="276" w:lineRule="auto"/>
-        <w:jc w:val="both"/>
-      </w:pPr>
-      <w:r>
-        <w:rPr>
-          <w:rFonts w:ascii="Calibri" w:hAnsi="Calibri"/>
-          <w:color w:val="1E293B"/>
-          <w:sz w:val="19"/>
-        </w:rPr>
-        <w:t>1. Lideranças de P&amp;D e Gestores de Inovação Aberta: responsáveis pela prospecção de soluções no ecossistema e customização de tecnologias;</w:t>
-      </w:r>
-    </w:p>
-    <w:p>
-      <w:pPr>
-        <w:spacing w:after="80" w:line="276" w:lineRule="auto"/>
-        <w:jc w:val="both"/>
-      </w:pPr>
-      <w:r>
-        <w:rPr>
-          <w:rFonts w:ascii="Calibri" w:hAnsi="Calibri"/>
-          <w:color w:val="1E293B"/>
-          <w:sz w:val="19"/>
-        </w:rPr>
-        <w:t>2. Lideranças de Diversidade, Equidade &amp; Inclusão (D&amp;I): responsáveis pelo diagnóstico interno de demandas, governança inclusiva e estratégia corporativa;</w:t>
-      </w:r>
-    </w:p>
-    <w:p>
-      <w:pPr>
-        <w:spacing w:after="80" w:line="276" w:lineRule="auto"/>
-        <w:jc w:val="both"/>
-      </w:pPr>
-      <w:r>
-        <w:rPr>
-          <w:rFonts w:ascii="Calibri" w:hAnsi="Calibri"/>
-          <w:color w:val="1E293B"/>
-          <w:sz w:val="19"/>
-        </w:rPr>
-        <w:t>3. Gestores de Tecnologia da Informação (TI) e Arquitetura de Sistemas: responsáveis pela integração de TA a ERPs legados, conformidade de segurança e infraestrutura;</w:t>
-      </w:r>
-    </w:p>
-    <w:p>
-      <w:pPr>
-        <w:spacing w:after="80" w:line="276" w:lineRule="auto"/>
-        <w:jc w:val="both"/>
-      </w:pPr>
-      <w:r>
-        <w:rPr>
-          <w:rFonts w:ascii="Calibri" w:hAnsi="Calibri"/>
-          <w:color w:val="1E293B"/>
-          <w:sz w:val="19"/>
-        </w:rPr>
-        <w:t>4. Especialistas de Saúde, Segurança do Trabalho (SST), Ergonomia e RH: responsáveis pela adequação física do posto de trabalho e acompanhamento funcional contínuo.</w:t>
-      </w:r>
-    </w:p>
-    <w:p>
-      <w:pPr>
-        <w:spacing w:before="200" w:after="60"/>
-      </w:pPr>
-      <w:r>
-        <w:rPr>
-          <w:rFonts w:ascii="Calibri" w:hAnsi="Calibri"/>
-          <w:b/>
-          <w:color w:val="0F172A"/>
-          <w:sz w:val="21"/>
-        </w:rPr>
-        <w:t>3.3 Matriz de Amarração Metodológica do Instrumento de Pesquisa (Quadro 1)</w:t>
+        <w:t>Na análise econômico-financeira, demonstra-se matematicamente a superioridade do Custo Total de Uso (TCU) no modelo servitizado. Enquanto o Capex imobiliza capital inicial elevado, gera custos estocásticos de manutenção e sofre perda integral por ociosidade quando o funcionário se desliga, o ATaaS permite a dedução integral das despesas operacionais no regime do Lucro Real (alíquota combinada de IRPJ e CSLL de 34%), mitiga o risco de ociosidade por reversão do ativo ao provedor e garante substituição imediata em caso de falha técnica.</w:t>
       </w:r>
     </w:p>
     <w:tbl>
@@ -878,15 +587,14 @@
         <w:tblLook w:firstColumn="1" w:firstRow="1" w:lastColumn="0" w:lastRow="0" w:noHBand="0" w:noVBand="1" w:val="04A0"/>
       </w:tblPr>
       <w:tblGrid>
-        <w:gridCol w:w="2484"/>
-        <w:gridCol w:w="2484"/>
-        <w:gridCol w:w="2484"/>
-        <w:gridCol w:w="2484"/>
+        <w:gridCol w:w="3312"/>
+        <w:gridCol w:w="3312"/>
+        <w:gridCol w:w="3312"/>
       </w:tblGrid>
       <w:tr>
         <w:tc>
           <w:tcPr>
-            <w:tcW w:type="dxa" w:w="2304"/>
+            <w:tcW w:type="dxa" w:w="2880"/>
             <w:shd w:fill="1E3A8A"/>
             <w:tcMar>
               <w:top w:w="100" w:type="dxa"/>
@@ -905,13 +613,13 @@
                 <w:color w:val="FFFFFF"/>
                 <w:sz w:val="17"/>
               </w:rPr>
-              <w:t>Dimensão Teórica (TOE &amp; Klein &amp; Sorra)</w:t>
+              <w:t>Dimensão de Análise</w:t>
             </w:r>
           </w:p>
         </w:tc>
         <w:tc>
           <w:tcPr>
-            <w:tcW w:type="dxa" w:w="2592"/>
+            <w:tcW w:type="dxa" w:w="3456"/>
             <w:shd w:fill="1E3A8A"/>
             <w:tcMar>
               <w:top w:w="100" w:type="dxa"/>
@@ -930,13 +638,13 @@
                 <w:color w:val="FFFFFF"/>
                 <w:sz w:val="17"/>
               </w:rPr>
-              <w:t>Variáveis Analíticas Investigadas</w:t>
+              <w:t>Modelo Tradicional (Transacional/Capex)</w:t>
             </w:r>
           </w:p>
         </w:tc>
         <w:tc>
           <w:tcPr>
-            <w:tcW w:type="dxa" w:w="3168"/>
+            <w:tcW w:type="dxa" w:w="3456"/>
             <w:shd w:fill="1E3A8A"/>
             <w:tcMar>
               <w:top w:w="100" w:type="dxa"/>
@@ -955,32 +663,7 @@
                 <w:color w:val="FFFFFF"/>
                 <w:sz w:val="17"/>
               </w:rPr>
-              <w:t>Foco do Roteiro de Entrevista Semiestruturada</w:t>
-            </w:r>
-          </w:p>
-        </w:tc>
-        <w:tc>
-          <w:tcPr>
-            <w:tcW w:type="dxa" w:w="1728"/>
-            <w:shd w:fill="1E3A8A"/>
-            <w:tcMar>
-              <w:top w:w="100" w:type="dxa"/>
-              <w:bottom w:w="100" w:type="dxa"/>
-              <w:left w:w="100" w:type="dxa"/>
-              <w:right w:w="100" w:type="dxa"/>
-            </w:tcMar>
-          </w:tcPr>
-          <w:p>
-            <w:pPr>
-              <w:jc w:val="center"/>
-            </w:pPr>
-            <w:r>
-              <w:rPr>
-                <w:b/>
-                <w:color w:val="FFFFFF"/>
-                <w:sz w:val="17"/>
-              </w:rPr>
-              <w:t>Perfis de Gestores</w:t>
+              <w:t>Modelo ATaaS (Servitizado/Opex)</w:t>
             </w:r>
           </w:p>
         </w:tc>
@@ -988,1120 +671,7 @@
       <w:tr>
         <w:tc>
           <w:tcPr>
-            <w:tcW w:type="dxa" w:w="2304"/>
-            <w:shd w:fill="F0F9FF"/>
-            <w:tcMar>
-              <w:top w:w="80" w:type="dxa"/>
-              <w:bottom w:w="80" w:type="dxa"/>
-              <w:left w:w="100" w:type="dxa"/>
-              <w:right w:w="100" w:type="dxa"/>
-            </w:tcMar>
-          </w:tcPr>
-          <w:p>
-            <w:pPr>
-              <w:spacing w:line="276" w:lineRule="auto"/>
-              <w:jc w:val="left"/>
-            </w:pPr>
-            <w:r>
-              <w:rPr>
-                <w:b/>
-                <w:sz w:val="16"/>
-              </w:rPr>
-              <w:t>Contexto Organizacional e Governança (TOE / Klein &amp; Sorra)</w:t>
-            </w:r>
-          </w:p>
-        </w:tc>
-        <w:tc>
-          <w:tcPr>
-            <w:tcW w:type="dxa" w:w="2592"/>
-            <w:shd w:fill="F0F9FF"/>
-            <w:tcMar>
-              <w:top w:w="80" w:type="dxa"/>
-              <w:bottom w:w="80" w:type="dxa"/>
-              <w:left w:w="100" w:type="dxa"/>
-              <w:right w:w="100" w:type="dxa"/>
-            </w:tcMar>
-          </w:tcPr>
-          <w:p>
-            <w:pPr>
-              <w:spacing w:line="276" w:lineRule="auto"/>
-              <w:jc w:val="left"/>
-            </w:pPr>
-            <w:r>
-              <w:rPr>
-                <w:sz w:val="16"/>
-              </w:rPr>
-              <w:t>• Fluxos decisórios de adoção</w:t>
-              <w:br/>
-              <w:t>• Articulação interfuncional</w:t>
-              <w:br/>
-              <w:t>• Patrocínio da liderança C-Level</w:t>
-            </w:r>
-          </w:p>
-        </w:tc>
-        <w:tc>
-          <w:tcPr>
-            <w:tcW w:type="dxa" w:w="3168"/>
-            <w:shd w:fill="F0F9FF"/>
-            <w:tcMar>
-              <w:top w:w="80" w:type="dxa"/>
-              <w:bottom w:w="80" w:type="dxa"/>
-              <w:left w:w="100" w:type="dxa"/>
-              <w:right w:w="100" w:type="dxa"/>
-            </w:tcMar>
-          </w:tcPr>
-          <w:p>
-            <w:pPr>
-              <w:spacing w:line="276" w:lineRule="auto"/>
-              <w:jc w:val="left"/>
-            </w:pPr>
-            <w:r>
-              <w:rPr>
-                <w:sz w:val="16"/>
-              </w:rPr>
-              <w:t>Como a demanda é mapeada e aprovada? Quais áreas participam da decisão (P&amp;D, D&amp;I, TI)? Existe orçamento dedicado para inovação inclusiva?</w:t>
-            </w:r>
-          </w:p>
-        </w:tc>
-        <w:tc>
-          <w:tcPr>
-            <w:tcW w:type="dxa" w:w="1728"/>
-            <w:shd w:fill="F0F9FF"/>
-            <w:tcMar>
-              <w:top w:w="80" w:type="dxa"/>
-              <w:bottom w:w="80" w:type="dxa"/>
-              <w:left w:w="100" w:type="dxa"/>
-              <w:right w:w="100" w:type="dxa"/>
-            </w:tcMar>
-          </w:tcPr>
-          <w:p>
-            <w:pPr>
-              <w:spacing w:line="276" w:lineRule="auto"/>
-              <w:jc w:val="left"/>
-            </w:pPr>
-            <w:r>
-              <w:rPr>
-                <w:sz w:val="16"/>
-              </w:rPr>
-              <w:t>Gestores de D&amp;I e Líderes de P&amp;D/Inovação</w:t>
-            </w:r>
-          </w:p>
-        </w:tc>
-      </w:tr>
-      <w:tr>
-        <w:tc>
-          <w:tcPr>
-            <w:tcW w:type="dxa" w:w="2304"/>
-            <w:shd w:fill="FFFFFF"/>
-            <w:tcMar>
-              <w:top w:w="80" w:type="dxa"/>
-              <w:bottom w:w="80" w:type="dxa"/>
-              <w:left w:w="100" w:type="dxa"/>
-              <w:right w:w="100" w:type="dxa"/>
-            </w:tcMar>
-          </w:tcPr>
-          <w:p>
-            <w:pPr>
-              <w:spacing w:line="276" w:lineRule="auto"/>
-              <w:jc w:val="left"/>
-            </w:pPr>
-            <w:r>
-              <w:rPr>
-                <w:b/>
-                <w:sz w:val="16"/>
-              </w:rPr>
-              <w:t>Contexto Tecnológico e Mútua Adaptação (TOE / Leonard-Barton)</w:t>
-            </w:r>
-          </w:p>
-        </w:tc>
-        <w:tc>
-          <w:tcPr>
-            <w:tcW w:type="dxa" w:w="2592"/>
-            <w:shd w:fill="FFFFFF"/>
-            <w:tcMar>
-              <w:top w:w="80" w:type="dxa"/>
-              <w:bottom w:w="80" w:type="dxa"/>
-              <w:left w:w="100" w:type="dxa"/>
-              <w:right w:w="100" w:type="dxa"/>
-            </w:tcMar>
-          </w:tcPr>
-          <w:p>
-            <w:pPr>
-              <w:spacing w:line="276" w:lineRule="auto"/>
-              <w:jc w:val="left"/>
-            </w:pPr>
-            <w:r>
-              <w:rPr>
-                <w:sz w:val="16"/>
-              </w:rPr>
-              <w:t>• Compatibilidade com ERPs legados</w:t>
-              <w:br/>
-              <w:t>• Práticas de co-design com usuários</w:t>
-              <w:br/>
-              <w:t>• Usabilidade e maturidade da TA</w:t>
-            </w:r>
-          </w:p>
-        </w:tc>
-        <w:tc>
-          <w:tcPr>
-            <w:tcW w:type="dxa" w:w="3168"/>
-            <w:shd w:fill="FFFFFF"/>
-            <w:tcMar>
-              <w:top w:w="80" w:type="dxa"/>
-              <w:bottom w:w="80" w:type="dxa"/>
-              <w:left w:w="100" w:type="dxa"/>
-              <w:right w:w="100" w:type="dxa"/>
-            </w:tcMar>
-          </w:tcPr>
-          <w:p>
-            <w:pPr>
-              <w:spacing w:line="276" w:lineRule="auto"/>
-              <w:jc w:val="left"/>
-            </w:pPr>
-            <w:r>
-              <w:rPr>
-                <w:sz w:val="16"/>
-              </w:rPr>
-              <w:t>A tecnologia é testada com o usuário antes da contratação? Quais foram os desafios de integração com sistemas legados (ERPs/CRMs corporativos)?</w:t>
-            </w:r>
-          </w:p>
-        </w:tc>
-        <w:tc>
-          <w:tcPr>
-            <w:tcW w:type="dxa" w:w="1728"/>
-            <w:shd w:fill="FFFFFF"/>
-            <w:tcMar>
-              <w:top w:w="80" w:type="dxa"/>
-              <w:bottom w:w="80" w:type="dxa"/>
-              <w:left w:w="100" w:type="dxa"/>
-              <w:right w:w="100" w:type="dxa"/>
-            </w:tcMar>
-          </w:tcPr>
-          <w:p>
-            <w:pPr>
-              <w:spacing w:line="276" w:lineRule="auto"/>
-              <w:jc w:val="left"/>
-            </w:pPr>
-            <w:r>
-              <w:rPr>
-                <w:sz w:val="16"/>
-              </w:rPr>
-              <w:t>Gestores de TI e Especialistas de P&amp;D</w:t>
-            </w:r>
-          </w:p>
-        </w:tc>
-      </w:tr>
-      <w:tr>
-        <w:tc>
-          <w:tcPr>
-            <w:tcW w:type="dxa" w:w="2304"/>
-            <w:shd w:fill="F0F9FF"/>
-            <w:tcMar>
-              <w:top w:w="80" w:type="dxa"/>
-              <w:bottom w:w="80" w:type="dxa"/>
-              <w:left w:w="100" w:type="dxa"/>
-              <w:right w:w="100" w:type="dxa"/>
-            </w:tcMar>
-          </w:tcPr>
-          <w:p>
-            <w:pPr>
-              <w:spacing w:line="276" w:lineRule="auto"/>
-              <w:jc w:val="left"/>
-            </w:pPr>
-            <w:r>
-              <w:rPr>
-                <w:b/>
-                <w:sz w:val="16"/>
-              </w:rPr>
-              <w:t>Clima de Implementação e Gestão de Mudança (Klein &amp; Sorra, 1996)</w:t>
-            </w:r>
-          </w:p>
-        </w:tc>
-        <w:tc>
-          <w:tcPr>
-            <w:tcW w:type="dxa" w:w="2592"/>
-            <w:shd w:fill="F0F9FF"/>
-            <w:tcMar>
-              <w:top w:w="80" w:type="dxa"/>
-              <w:bottom w:w="80" w:type="dxa"/>
-              <w:left w:w="100" w:type="dxa"/>
-              <w:right w:w="100" w:type="dxa"/>
-            </w:tcMar>
-          </w:tcPr>
-          <w:p>
-            <w:pPr>
-              <w:spacing w:line="276" w:lineRule="auto"/>
-              <w:jc w:val="left"/>
-            </w:pPr>
-            <w:r>
-              <w:rPr>
-                <w:sz w:val="16"/>
-              </w:rPr>
-              <w:t>• Políticas de capacitação contínua</w:t>
-              <w:br/>
-              <w:t>• Sensibilização de pares e líderes</w:t>
-              <w:br/>
-              <w:t>• Remoção de atritos de uso</w:t>
-            </w:r>
-          </w:p>
-        </w:tc>
-        <w:tc>
-          <w:tcPr>
-            <w:tcW w:type="dxa" w:w="3168"/>
-            <w:shd w:fill="F0F9FF"/>
-            <w:tcMar>
-              <w:top w:w="80" w:type="dxa"/>
-              <w:bottom w:w="80" w:type="dxa"/>
-              <w:left w:w="100" w:type="dxa"/>
-              <w:right w:w="100" w:type="dxa"/>
-            </w:tcMar>
-          </w:tcPr>
-          <w:p>
-            <w:pPr>
-              <w:spacing w:line="276" w:lineRule="auto"/>
-              <w:jc w:val="left"/>
-            </w:pPr>
-            <w:r>
-              <w:rPr>
-                <w:sz w:val="16"/>
-              </w:rPr>
-              <w:t>Que treinamento é oferecido ao usuário e à equipe direta? Como a liderança monitora a assimilação da tecnologia e combate preconceitos velados?</w:t>
-            </w:r>
-          </w:p>
-        </w:tc>
-        <w:tc>
-          <w:tcPr>
-            <w:tcW w:type="dxa" w:w="1728"/>
-            <w:shd w:fill="F0F9FF"/>
-            <w:tcMar>
-              <w:top w:w="80" w:type="dxa"/>
-              <w:bottom w:w="80" w:type="dxa"/>
-              <w:left w:w="100" w:type="dxa"/>
-              <w:right w:w="100" w:type="dxa"/>
-            </w:tcMar>
-          </w:tcPr>
-          <w:p>
-            <w:pPr>
-              <w:spacing w:line="276" w:lineRule="auto"/>
-              <w:jc w:val="left"/>
-            </w:pPr>
-            <w:r>
-              <w:rPr>
-                <w:sz w:val="16"/>
-              </w:rPr>
-              <w:t>Gestores de D&amp;I e Lideranças de Operações/RH</w:t>
-            </w:r>
-          </w:p>
-        </w:tc>
-      </w:tr>
-      <w:tr>
-        <w:tc>
-          <w:tcPr>
-            <w:tcW w:type="dxa" w:w="2304"/>
-            <w:shd w:fill="FFFFFF"/>
-            <w:tcMar>
-              <w:top w:w="80" w:type="dxa"/>
-              <w:bottom w:w="80" w:type="dxa"/>
-              <w:left w:w="100" w:type="dxa"/>
-              <w:right w:w="100" w:type="dxa"/>
-            </w:tcMar>
-          </w:tcPr>
-          <w:p>
-            <w:pPr>
-              <w:spacing w:line="276" w:lineRule="auto"/>
-              <w:jc w:val="left"/>
-            </w:pPr>
-            <w:r>
-              <w:rPr>
-                <w:b/>
-                <w:sz w:val="16"/>
-              </w:rPr>
-              <w:t>Sustentação e Efetividade da Inovação (Rogers / Klein &amp; Sorra)</w:t>
-            </w:r>
-          </w:p>
-        </w:tc>
-        <w:tc>
-          <w:tcPr>
-            <w:tcW w:type="dxa" w:w="2592"/>
-            <w:shd w:fill="FFFFFF"/>
-            <w:tcMar>
-              <w:top w:w="80" w:type="dxa"/>
-              <w:bottom w:w="80" w:type="dxa"/>
-              <w:left w:w="100" w:type="dxa"/>
-              <w:right w:w="100" w:type="dxa"/>
-            </w:tcMar>
-          </w:tcPr>
-          <w:p>
-            <w:pPr>
-              <w:spacing w:line="276" w:lineRule="auto"/>
-              <w:jc w:val="left"/>
-            </w:pPr>
-            <w:r>
-              <w:rPr>
-                <w:sz w:val="16"/>
-              </w:rPr>
-              <w:t>• SLA de suporte e manutenção ágil</w:t>
-              <w:br/>
-              <w:t>• Gestão de obsolescência tecnológica</w:t>
-              <w:br/>
-              <w:t>• KPIs de efetividade da inovação</w:t>
-            </w:r>
-          </w:p>
-        </w:tc>
-        <w:tc>
-          <w:tcPr>
-            <w:tcW w:type="dxa" w:w="3168"/>
-            <w:shd w:fill="FFFFFF"/>
-            <w:tcMar>
-              <w:top w:w="80" w:type="dxa"/>
-              <w:bottom w:w="80" w:type="dxa"/>
-              <w:left w:w="100" w:type="dxa"/>
-              <w:right w:w="100" w:type="dxa"/>
-            </w:tcMar>
-          </w:tcPr>
-          <w:p>
-            <w:pPr>
-              <w:spacing w:line="276" w:lineRule="auto"/>
-              <w:jc w:val="left"/>
-            </w:pPr>
-            <w:r>
-              <w:rPr>
-                <w:sz w:val="16"/>
-              </w:rPr>
-              <w:t>Quais métricas a empresa monitora (produtividade, retenção, satisfação)? Como é gerenciada a manutenção rápida e substituição preventiva?</w:t>
-            </w:r>
-          </w:p>
-        </w:tc>
-        <w:tc>
-          <w:tcPr>
-            <w:tcW w:type="dxa" w:w="1728"/>
-            <w:shd w:fill="FFFFFF"/>
-            <w:tcMar>
-              <w:top w:w="80" w:type="dxa"/>
-              <w:bottom w:w="80" w:type="dxa"/>
-              <w:left w:w="100" w:type="dxa"/>
-              <w:right w:w="100" w:type="dxa"/>
-            </w:tcMar>
-          </w:tcPr>
-          <w:p>
-            <w:pPr>
-              <w:spacing w:line="276" w:lineRule="auto"/>
-              <w:jc w:val="left"/>
-            </w:pPr>
-            <w:r>
-              <w:rPr>
-                <w:sz w:val="16"/>
-              </w:rPr>
-              <w:t>Gestores de TI, RH e Operações</w:t>
-            </w:r>
-          </w:p>
-        </w:tc>
-      </w:tr>
-    </w:tbl>
-    <w:p>
-      <w:pPr>
-        <w:spacing w:after="40"/>
-      </w:pPr>
-    </w:p>
-    <w:p>
-      <w:pPr>
-        <w:spacing w:after="160"/>
-        <w:jc w:val="center"/>
-      </w:pPr>
-      <w:r>
-        <w:rPr>
-          <w:i/>
-          <w:color w:val="64748B"/>
-          <w:sz w:val="17"/>
-        </w:rPr>
-        <w:t>Quadro 1: Matriz de Amarração Metodológica do Roteiro de Pesquisa de Campo.</w:t>
-        <w:br/>
-        <w:t>Fonte: Elaborado pelos autores (2026).</w:t>
-      </w:r>
-    </w:p>
-    <w:p>
-      <w:pPr>
-        <w:spacing w:before="200" w:after="60"/>
-      </w:pPr>
-      <w:r>
-        <w:rPr>
-          <w:rFonts w:ascii="Calibri" w:hAnsi="Calibri"/>
-          <w:b/>
-          <w:color w:val="0F172A"/>
-          <w:sz w:val="21"/>
-        </w:rPr>
-        <w:t>3.4 Procedimentos de Análise dos Dados Primários</w:t>
-      </w:r>
-    </w:p>
-    <w:p>
-      <w:pPr>
-        <w:spacing w:after="80" w:line="276" w:lineRule="auto"/>
-        <w:jc w:val="both"/>
-      </w:pPr>
-      <w:r>
-        <w:rPr>
-          <w:rFonts w:ascii="Calibri" w:hAnsi="Calibri"/>
-          <w:color w:val="1E293B"/>
-          <w:sz w:val="19"/>
-        </w:rPr>
-        <w:t>O corpus oriundo das transcrições é submetido à técnica de Análise de Conteúdo Temático-Categorial (Bardin, 2016; Braun &amp; Clarke, 2006). A categorização organiza-se a priori a partir das dimensões do framework TOE e dos construtos de Klein e Sorra (1996), permitindo inferências comparativas e identificação de padrões de maturidade organizacional na gestão da implementação.</w:t>
-      </w:r>
-    </w:p>
-    <w:p>
-      <w:pPr>
-        <w:spacing w:before="280" w:after="80"/>
-      </w:pPr>
-      <w:r>
-        <w:rPr>
-          <w:rFonts w:ascii="Calibri" w:hAnsi="Calibri"/>
-          <w:b/>
-          <w:color w:val="1E3A8A"/>
-          <w:sz w:val="23"/>
-        </w:rPr>
-        <w:t>SEÇÃO X.4: ANÁLISE E DISCUSSÃO DOS RESULTADOS</w:t>
-      </w:r>
-    </w:p>
-    <w:p>
-      <w:pPr>
-        <w:spacing w:before="200" w:after="60"/>
-      </w:pPr>
-      <w:r>
-        <w:rPr>
-          <w:rFonts w:ascii="Calibri" w:hAnsi="Calibri"/>
-          <w:b/>
-          <w:color w:val="0F172A"/>
-          <w:sz w:val="21"/>
-        </w:rPr>
-        <w:t>4.1 Governança Corporativa e Processo Decisório na Adoção de TA</w:t>
-      </w:r>
-    </w:p>
-    <w:p>
-      <w:pPr>
-        <w:spacing w:after="80" w:line="276" w:lineRule="auto"/>
-        <w:jc w:val="both"/>
-      </w:pPr>
-      <w:r>
-        <w:rPr>
-          <w:rFonts w:ascii="Calibri" w:hAnsi="Calibri"/>
-          <w:color w:val="1E293B"/>
-          <w:sz w:val="19"/>
-        </w:rPr>
-        <w:t>A investigação empírica evidencia um padrão claro nas empresas analisadas: organizações com baixo índice de retenção tratam a introdução de TAs como uma rotina burocrática do setor de Recursos Humanos para atendimento à Lei de Cotas, sem qualquer interface com áreas de engenharia ou inovação. Em contrapartida, empresas líderes estruturam comitês multidisciplinares permanentes que unem D&amp;I, TI e P&amp;D, garantindo alinhamento prévio entre a demanda funcional do trabalhador e a capacidade de suporte corporativo.</w:t>
-      </w:r>
-    </w:p>
-    <w:p>
-      <w:pPr>
-        <w:spacing w:before="200" w:after="60"/>
-      </w:pPr>
-      <w:r>
-        <w:rPr>
-          <w:rFonts w:ascii="Calibri" w:hAnsi="Calibri"/>
-          <w:b/>
-          <w:color w:val="0F172A"/>
-          <w:sz w:val="21"/>
-        </w:rPr>
-        <w:t>4.2 O Contexto Tecnológico e as Dinâmicas de Mútua Adaptação (Leonard-Barton, 1988)</w:t>
-      </w:r>
-    </w:p>
-    <w:p>
-      <w:pPr>
-        <w:spacing w:after="80" w:line="276" w:lineRule="auto"/>
-        <w:jc w:val="both"/>
-      </w:pPr>
-      <w:r>
-        <w:rPr>
-          <w:rFonts w:ascii="Calibri" w:hAnsi="Calibri"/>
-          <w:color w:val="1E293B"/>
-          <w:sz w:val="19"/>
-        </w:rPr>
-        <w:t>Na dimensão tecnológica, o principal obstáculo reportado pelos gestores de TI reside na inacessibilidade de sistemas corporativos legados (CRMs, intranets e ERPs líderes de mercado). Mesmo quando a empresa adquire um leitor de tela ou mouse adaptado de última geração, a incompatibilidade das telas corporativas impede a execução do trabalho. Superar esse gargalo exige a aplicação da mútua adaptação (Leonard-Barton, 1988): a organização necessita desenvolver camadas de API acessíveis ou customizar fluxos de software em regime de co-design ativo com os próprios colaboradores com deficiência.</w:t>
-      </w:r>
-    </w:p>
-    <w:p>
-      <w:pPr>
-        <w:spacing w:before="200" w:after="60"/>
-      </w:pPr>
-      <w:r>
-        <w:rPr>
-          <w:rFonts w:ascii="Calibri" w:hAnsi="Calibri"/>
-          <w:b/>
-          <w:color w:val="0F172A"/>
-          <w:sz w:val="21"/>
-        </w:rPr>
-        <w:t>4.3 O Contexto Organizacional e a Construção do Clima de Implementação (Klein &amp; Sorra, 1996)</w:t>
-      </w:r>
-    </w:p>
-    <w:p>
-      <w:pPr>
-        <w:spacing w:after="80" w:line="276" w:lineRule="auto"/>
-        <w:jc w:val="both"/>
-      </w:pPr>
-      <w:r>
-        <w:rPr>
-          <w:rFonts w:ascii="Calibri" w:hAnsi="Calibri"/>
-          <w:color w:val="1E293B"/>
-          <w:sz w:val="19"/>
-        </w:rPr>
-        <w:t>Em consonância com o modelo de Klein e Sorra (1996), a mera disponibilidade do equipamento não garante sua utilização. As entrevistas revelam que o abandono ocorre com frequência quando o trabalhador se sente isolado ou constrangido perante seus pares. O clima de implementação efetivo demanda treinamentos que envolvam toda a equipe direta e gestores imediatos, transformando o uso da tecnologia em uma prática valorizada e integrada aos valores corporativos de excelência e inovação.</w:t>
-      </w:r>
-    </w:p>
-    <w:p>
-      <w:pPr>
-        <w:spacing w:before="200" w:after="60"/>
-      </w:pPr>
-      <w:r>
-        <w:rPr>
-          <w:rFonts w:ascii="Calibri" w:hAnsi="Calibri"/>
-          <w:b/>
-          <w:color w:val="0F172A"/>
-          <w:sz w:val="21"/>
-        </w:rPr>
-        <w:t>4.4 Práticas de Sustentação do Ciclo de Vida e Métricas de Efetividade da Inovação</w:t>
-      </w:r>
-    </w:p>
-    <w:p>
-      <w:pPr>
-        <w:spacing w:after="80" w:line="276" w:lineRule="auto"/>
-        <w:jc w:val="both"/>
-      </w:pPr>
-      <w:r>
-        <w:rPr>
-          <w:rFonts w:ascii="Calibri" w:hAnsi="Calibri"/>
-          <w:color w:val="1E293B"/>
-          <w:sz w:val="19"/>
-        </w:rPr>
-        <w:t>Um dos achados mais críticos concerne à fragilidade do suporte pós-implantação. Equipamentos sofisticados paralisados por semanas por ausência de contrato ágil de manutenção corretiva ou peças de reposição inviabilizam a rotinização (Rogers, 2003). As empresas mais avançadas estabelecem SLAs contratuais agressivos de reposição em 24h e substituem métricas puramente quantitativas de cotas por indicadores de efetividade da inovação: uptime de TA, índice de autonomia produtiva e progressão de carreira de usuários.</w:t>
-      </w:r>
-    </w:p>
-    <w:p>
-      <w:pPr>
-        <w:spacing w:after="80"/>
-      </w:pPr>
-    </w:p>
-    <w:p>
-      <w:pPr>
-        <w:spacing w:after="40"/>
-        <w:jc w:val="center"/>
-      </w:pPr>
-      <w:r>
-        <w:drawing>
-          <wp:inline xmlns:a="http://schemas.openxmlformats.org/drawingml/2006/main" xmlns:pic="http://schemas.openxmlformats.org/drawingml/2006/picture">
-            <wp:extent cx="6035040" cy="2787614"/>
-            <wp:docPr id="2" name="Picture 2"/>
-            <wp:cNvGraphicFramePr>
-              <a:graphicFrameLocks noChangeAspect="1"/>
-            </wp:cNvGraphicFramePr>
-            <a:graphic>
-              <a:graphicData uri="http://schemas.openxmlformats.org/drawingml/2006/picture">
-                <pic:pic>
-                  <pic:nvPicPr>
-                    <pic:cNvPr id="0" name="figura2_ciclo_implementacao_ta.png"/>
-                    <pic:cNvPicPr/>
-                  </pic:nvPicPr>
-                  <pic:blipFill>
-                    <a:blip r:embed="rId10"/>
-                    <a:stretch>
-                      <a:fillRect/>
-                    </a:stretch>
-                  </pic:blipFill>
-                  <pic:spPr>
-                    <a:xfrm>
-                      <a:off x="0" y="0"/>
-                      <a:ext cx="6035040" cy="2787614"/>
-                    </a:xfrm>
-                    <a:prstGeom prst="rect"/>
-                  </pic:spPr>
-                </pic:pic>
-              </a:graphicData>
-            </a:graphic>
-          </wp:inline>
-        </w:drawing>
-      </w:r>
-    </w:p>
-    <w:p>
-      <w:pPr>
-        <w:spacing w:after="240"/>
-        <w:jc w:val="center"/>
-      </w:pPr>
-      <w:r>
-        <w:rPr>
-          <w:i/>
-          <w:color w:val="64748B"/>
-          <w:sz w:val="17"/>
-        </w:rPr>
-        <w:t>Figura 2: Modelo Integrador de Implementação Corporativa de Tecnologias Assistivas (TOE &amp; Klein &amp; Sorra).</w:t>
-        <w:br/>
-        <w:t>Fonte: Elaborado pelos autores (2026).</w:t>
-      </w:r>
-    </w:p>
-    <w:p>
-      <w:pPr>
-        <w:spacing w:before="280" w:after="80"/>
-      </w:pPr>
-      <w:r>
-        <w:rPr>
-          <w:rFonts w:ascii="Calibri" w:hAnsi="Calibri"/>
-          <w:b/>
-          <w:color w:val="1E3A8A"/>
-          <w:sz w:val="23"/>
-        </w:rPr>
-        <w:t>SEÇÃO X.5: FRAMEWORK DE GESTÃO DA INOVAÇÃO ASSISTIVA CORPORATIVA</w:t>
-      </w:r>
-    </w:p>
-    <w:p>
-      <w:pPr>
-        <w:spacing w:after="80" w:line="276" w:lineRule="auto"/>
-        <w:jc w:val="both"/>
-      </w:pPr>
-      <w:r>
-        <w:rPr>
-          <w:rFonts w:ascii="Calibri" w:hAnsi="Calibri"/>
-          <w:color w:val="1E293B"/>
-          <w:sz w:val="19"/>
-        </w:rPr>
-        <w:t>Como principal contribuição prescritiva para gestores de P&amp;D, D&amp;I e TI, o estudo consolida um Framework de Gestão Estratégica da Inovação Assistiva estruturado em quatro pilares integrados:</w:t>
-      </w:r>
-    </w:p>
-    <w:p>
-      <w:pPr>
-        <w:spacing w:after="80" w:line="276" w:lineRule="auto"/>
-        <w:jc w:val="both"/>
-      </w:pPr>
-      <w:r>
-        <w:rPr>
-          <w:rFonts w:ascii="Calibri" w:hAnsi="Calibri"/>
-          <w:color w:val="1E293B"/>
-          <w:sz w:val="19"/>
-        </w:rPr>
-        <w:t>1. Governança Interfuncional Integrada: Criação de comitês multidisciplinares (P&amp;D, D&amp;I, TI, RH e usuários PcD) com orçamento dedicado e patrocínio da alta liderança;</w:t>
-      </w:r>
-    </w:p>
-    <w:p>
-      <w:pPr>
-        <w:spacing w:after="80" w:line="276" w:lineRule="auto"/>
-        <w:jc w:val="both"/>
-      </w:pPr>
-      <w:r>
-        <w:rPr>
-          <w:rFonts w:ascii="Calibri" w:hAnsi="Calibri"/>
-          <w:color w:val="1E293B"/>
-          <w:sz w:val="19"/>
-        </w:rPr>
-        <w:t>2. Protocolo de Mútua Adaptação e Co-Design Técnico: Instituição de pilotos de validação prévia no posto real, parametrização individual e homologação de acessibilidade em sistemas corporativos legados;</w:t>
-      </w:r>
-    </w:p>
-    <w:p>
-      <w:pPr>
-        <w:spacing w:after="80" w:line="276" w:lineRule="auto"/>
-        <w:jc w:val="both"/>
-      </w:pPr>
-      <w:r>
-        <w:rPr>
-          <w:rFonts w:ascii="Calibri" w:hAnsi="Calibri"/>
-          <w:color w:val="1E293B"/>
-          <w:sz w:val="19"/>
-        </w:rPr>
-        <w:t>3. Estruturação do Clima de Implementação: Programas continuados de capacitação para usuários, pares e gestores, desmistificando o uso das ferramentas e eliminando barreiras atitudinais;</w:t>
-      </w:r>
-    </w:p>
-    <w:p>
-      <w:pPr>
-        <w:spacing w:after="80" w:line="276" w:lineRule="auto"/>
-        <w:jc w:val="both"/>
-      </w:pPr>
-      <w:r>
-        <w:rPr>
-          <w:rFonts w:ascii="Calibri" w:hAnsi="Calibri"/>
-          <w:color w:val="1E293B"/>
-          <w:sz w:val="19"/>
-        </w:rPr>
-        <w:t>4. Sustentação do Ciclo de Vida e Métricas de Efetividade: Estabelecimento de SLAs de manutenção preventiva/corretiva rápida, gestão de obsolescência e monitoramento de KPIs de retenção, satisfação e produtividade.</w:t>
-      </w:r>
-    </w:p>
-    <w:p>
-      <w:pPr>
-        <w:spacing w:before="280" w:after="80"/>
-      </w:pPr>
-      <w:r>
-        <w:rPr>
-          <w:rFonts w:ascii="Calibri" w:hAnsi="Calibri"/>
-          <w:b/>
-          <w:color w:val="1E3A8A"/>
-          <w:sz w:val="23"/>
-        </w:rPr>
-        <w:t>SEÇÃO X.6: CONSIDERAÇÕES FINAIS</w:t>
-      </w:r>
-    </w:p>
-    <w:p>
-      <w:pPr>
-        <w:spacing w:after="80" w:line="276" w:lineRule="auto"/>
-        <w:jc w:val="both"/>
-      </w:pPr>
-      <w:r>
-        <w:rPr>
-          <w:rFonts w:ascii="Calibri" w:hAnsi="Calibri"/>
-          <w:color w:val="1E293B"/>
-          <w:sz w:val="19"/>
-        </w:rPr>
-        <w:t>O estudo evidencia que a implementação de tecnologias assistivas no ambiente corporativo não pode ser reduzida a uma ação filantrópica ou cumprimento passivo de cotas legais: trata-se de uma dimensão legítima e estratégica da Gestão da Inovação Organizacional. A efetividade da implementação decorre da capacidade da firma em orquestrar competências multidisciplinares, promover mútua adaptação tecnológica e cultivar um clima organizacional de suporte ativo.</w:t>
-      </w:r>
-    </w:p>
-    <w:p>
-      <w:pPr>
-        <w:spacing w:after="80" w:line="276" w:lineRule="auto"/>
-        <w:jc w:val="both"/>
-      </w:pPr>
-      <w:r>
-        <w:rPr>
-          <w:rFonts w:ascii="Calibri" w:hAnsi="Calibri"/>
-          <w:color w:val="1E293B"/>
-          <w:sz w:val="19"/>
-        </w:rPr>
-        <w:t>Como contribuição teórica, o artigo preenche uma lacuna crítica ao integrar os modelos de Klein e Sorra (1996), Leonard-Barton (1988) e TOE (Tornatzky &amp; Fleischer, 1990) ao estudo das Tecnologias Assistivas no trabalho. Como contribuição prática, oferece um roadmap claro para líderes executivos transformarem investimentos em acessibilidade em valor corporativo e capacidades dinâmicas sustentáveis. As limitações do estudo concentram-se no escopo de médias e grandes empresas, recomendando-se para pesquisas futuras estudos longitudinais sobre o retorno sobre investimento (ROI) da implementação de TAs e investigações específicas sobre o ecossistema de micro e pequenas empresas (MPEs).</w:t>
-      </w:r>
-    </w:p>
-    <w:p>
-      <w:pPr>
-        <w:spacing w:before="280" w:after="80"/>
-      </w:pPr>
-      <w:r>
-        <w:rPr>
-          <w:rFonts w:ascii="Calibri" w:hAnsi="Calibri"/>
-          <w:b/>
-          <w:color w:val="1E3A8A"/>
-          <w:sz w:val="23"/>
-        </w:rPr>
-        <w:t>SEÇÃO -: REFERÊNCIAS BIBLIOGRÁFICAS (NORMAS ABNT NBR 6023)</w:t>
-      </w:r>
-    </w:p>
-    <w:p>
-      <w:pPr>
-        <w:spacing w:after="60" w:line="276" w:lineRule="auto"/>
-      </w:pPr>
-      <w:r>
-        <w:rPr>
-          <w:rFonts w:ascii="Calibri" w:hAnsi="Calibri"/>
-          <w:color w:val="334155"/>
-          <w:sz w:val="17"/>
-        </w:rPr>
-        <w:t>ADNER, Ron. Match your innovation strategy to your innovation ecosystem. Harvard Business Review, v. 84, n. 4, p. 98-107, 2006.</w:t>
-      </w:r>
-    </w:p>
-    <w:p>
-      <w:pPr>
-        <w:spacing w:after="60" w:line="276" w:lineRule="auto"/>
-      </w:pPr>
-      <w:r>
-        <w:rPr>
-          <w:rFonts w:ascii="Calibri" w:hAnsi="Calibri"/>
-          <w:color w:val="334155"/>
-          <w:sz w:val="17"/>
-        </w:rPr>
-        <w:t>BAKER, Jeff. The Technology-Organization-Environment framework. In: DWORIN, Y. K. (Ed.). Information systems theory: explaining and predicting our digital society. New York: Springer, 2012. v. 1, p. 231-244.</w:t>
-      </w:r>
-    </w:p>
-    <w:p>
-      <w:pPr>
-        <w:spacing w:after="60" w:line="276" w:lineRule="auto"/>
-      </w:pPr>
-      <w:r>
-        <w:rPr>
-          <w:rFonts w:ascii="Calibri" w:hAnsi="Calibri"/>
-          <w:color w:val="334155"/>
-          <w:sz w:val="17"/>
-        </w:rPr>
-        <w:t>BARDIN, Laurence. Análise de conteúdo. São Paulo: Edições 70, 2016.</w:t>
-      </w:r>
-    </w:p>
-    <w:p>
-      <w:pPr>
-        <w:spacing w:after="60" w:line="276" w:lineRule="auto"/>
-      </w:pPr>
-      <w:r>
-        <w:rPr>
-          <w:rFonts w:ascii="Calibri" w:hAnsi="Calibri"/>
-          <w:color w:val="334155"/>
-          <w:sz w:val="17"/>
-        </w:rPr>
-        <w:t>BERSCH, Rita. Introdução à Tecnologia Assistiva. Porto Alegre: Centro Especializado em Desenvolvimento de Tecnologias Assistivas (CETA), 2017.</w:t>
-      </w:r>
-    </w:p>
-    <w:p>
-      <w:pPr>
-        <w:spacing w:after="60" w:line="276" w:lineRule="auto"/>
-      </w:pPr>
-      <w:r>
-        <w:rPr>
-          <w:rFonts w:ascii="Calibri" w:hAnsi="Calibri"/>
-          <w:color w:val="334155"/>
-          <w:sz w:val="17"/>
-        </w:rPr>
-        <w:t>BRAUN, Virginia; CLARKE, Victoria. Using thematic analysis in psychology. Qualitative Research in Psychology, v. 3, n. 2, p. 77-101, 2006.</w:t>
-      </w:r>
-    </w:p>
-    <w:p>
-      <w:pPr>
-        <w:spacing w:after="60" w:line="276" w:lineRule="auto"/>
-      </w:pPr>
-      <w:r>
-        <w:rPr>
-          <w:rFonts w:ascii="Calibri" w:hAnsi="Calibri"/>
-          <w:color w:val="334155"/>
-          <w:sz w:val="17"/>
-        </w:rPr>
-        <w:t>DAVIS, Fred D. Perceived usefulness, perceived ease of use, and user acceptance of information technology. MIS Quarterly, v. 13, n. 3, p. 319-340, 1989.</w:t>
-      </w:r>
-    </w:p>
-    <w:p>
-      <w:pPr>
-        <w:spacing w:after="60" w:line="276" w:lineRule="auto"/>
-      </w:pPr>
-      <w:r>
-        <w:rPr>
-          <w:rFonts w:ascii="Calibri" w:hAnsi="Calibri"/>
-          <w:color w:val="334155"/>
-          <w:sz w:val="17"/>
-        </w:rPr>
-        <w:t>GALVÃO FILHO, Teófilo Alves. A tecnologia assistiva: de que se trata? In: MACHADO, G. J. C.; SOBRAL, M. N. (Org.). Conexões: educação, comunicação, inclusão e interculturalidade. Porto Alegre: Redes Editora, 2009. p. 207-235.</w:t>
-      </w:r>
-    </w:p>
-    <w:p>
-      <w:pPr>
-        <w:spacing w:after="60" w:line="276" w:lineRule="auto"/>
-      </w:pPr>
-      <w:r>
-        <w:rPr>
-          <w:rFonts w:ascii="Calibri" w:hAnsi="Calibri"/>
-          <w:color w:val="334155"/>
-          <w:sz w:val="17"/>
-        </w:rPr>
-        <w:t>KLEIN, Katherine J.; SORRA, Joann Speer. The challenge of innovation implementation. Academy of Management Review, v. 21, n. 4, p. 1055-1080, 1996.</w:t>
-      </w:r>
-    </w:p>
-    <w:p>
-      <w:pPr>
-        <w:spacing w:after="60" w:line="276" w:lineRule="auto"/>
-      </w:pPr>
-      <w:r>
-        <w:rPr>
-          <w:rFonts w:ascii="Calibri" w:hAnsi="Calibri"/>
-          <w:color w:val="334155"/>
-          <w:sz w:val="17"/>
-        </w:rPr>
-        <w:t>LEONARD-BARTON, Dorothy. Implementation as mutual adaptation of technology and organization. Research Policy, v. 17, n. 5, p. 251-267, 1988.</w:t>
-      </w:r>
-    </w:p>
-    <w:p>
-      <w:pPr>
-        <w:spacing w:after="60" w:line="276" w:lineRule="auto"/>
-      </w:pPr>
-      <w:r>
-        <w:rPr>
-          <w:rFonts w:ascii="Calibri" w:hAnsi="Calibri"/>
-          <w:color w:val="334155"/>
-          <w:sz w:val="17"/>
-        </w:rPr>
-        <w:t>PHILLIPS, Brenda; ZHAO, Hong. Predictors of assistive technology abandonment. Assistive Technology, v. 5, n. 1, p. 36-45, 1993.</w:t>
-      </w:r>
-    </w:p>
-    <w:p>
-      <w:pPr>
-        <w:spacing w:after="60" w:line="276" w:lineRule="auto"/>
-      </w:pPr>
-      <w:r>
-        <w:rPr>
-          <w:rFonts w:ascii="Calibri" w:hAnsi="Calibri"/>
-          <w:color w:val="334155"/>
-          <w:sz w:val="17"/>
-        </w:rPr>
-        <w:t>PISANO, Gary P. You need an innovation strategy. Harvard Business Review, v. 93, n. 6, p. 44-54, 2015.</w:t>
-      </w:r>
-    </w:p>
-    <w:p>
-      <w:pPr>
-        <w:spacing w:after="60" w:line="276" w:lineRule="auto"/>
-      </w:pPr>
-      <w:r>
-        <w:rPr>
-          <w:rFonts w:ascii="Calibri" w:hAnsi="Calibri"/>
-          <w:color w:val="334155"/>
-          <w:sz w:val="17"/>
-        </w:rPr>
-        <w:t>ROGERS, Everett M. Diffusion of innovations. 5. ed. New York: Free Press, 2003.</w:t>
-      </w:r>
-    </w:p>
-    <w:p>
-      <w:pPr>
-        <w:spacing w:after="60" w:line="276" w:lineRule="auto"/>
-      </w:pPr>
-      <w:r>
-        <w:rPr>
-          <w:rFonts w:ascii="Calibri" w:hAnsi="Calibri"/>
-          <w:color w:val="334155"/>
-          <w:sz w:val="17"/>
-        </w:rPr>
-        <w:t>SCHERER, Marcia J. Assessing the benefits of assistive technology for people with disabilities: The Matching Person &amp; Technology model. Technology and Disability, v. 17, n. 4, p. 247-254, 2005.</w:t>
-      </w:r>
-    </w:p>
-    <w:p>
-      <w:pPr>
-        <w:spacing w:after="60" w:line="276" w:lineRule="auto"/>
-      </w:pPr>
-      <w:r>
-        <w:rPr>
-          <w:rFonts w:ascii="Calibri" w:hAnsi="Calibri"/>
-          <w:color w:val="334155"/>
-          <w:sz w:val="17"/>
-        </w:rPr>
-        <w:t>SUGAWARA, Marcia et al. Fatores associados ao abandono de tecnologias assistivas no contexto ocupacional. Revista Brasileira de Saúde Ocupacional, v. 43, e12, 2018.</w:t>
-      </w:r>
-    </w:p>
-    <w:p>
-      <w:pPr>
-        <w:spacing w:after="60" w:line="276" w:lineRule="auto"/>
-      </w:pPr>
-      <w:r>
-        <w:rPr>
-          <w:rFonts w:ascii="Calibri" w:hAnsi="Calibri"/>
-          <w:color w:val="334155"/>
-          <w:sz w:val="17"/>
-        </w:rPr>
-        <w:t>TIDD, Joe; BESSANT, John. Gestão da Inovação. 5. ed. Porto Alegre: Bookman, 2015.</w:t>
-      </w:r>
-    </w:p>
-    <w:p>
-      <w:pPr>
-        <w:spacing w:after="60" w:line="276" w:lineRule="auto"/>
-      </w:pPr>
-      <w:r>
-        <w:rPr>
-          <w:rFonts w:ascii="Calibri" w:hAnsi="Calibri"/>
-          <w:color w:val="334155"/>
-          <w:sz w:val="17"/>
-        </w:rPr>
-        <w:t>TORNATZKY, Louis G.; FLEISCHER, Mitchell. The processes of technological innovation. Lexington: Lexington Books, 1990.</w:t>
-      </w:r>
-    </w:p>
-    <w:p>
-      <w:pPr>
-        <w:spacing w:after="60" w:line="276" w:lineRule="auto"/>
-      </w:pPr>
-      <w:r>
-        <w:rPr>
-          <w:rFonts w:ascii="Calibri" w:hAnsi="Calibri"/>
-          <w:color w:val="334155"/>
-          <w:sz w:val="17"/>
-        </w:rPr>
-        <w:t>VENKATESH, Viswanath et al. User acceptance of information technology: Toward a unified view. MIS Quarterly, v. 27, n. 3, p. 425-478, 2003.</w:t>
-      </w:r>
-    </w:p>
-    <w:p>
-      <w:pPr>
-        <w:spacing w:before="280" w:after="80"/>
-      </w:pPr>
-      <w:r>
-        <w:rPr>
-          <w:rFonts w:ascii="Calibri" w:hAnsi="Calibri"/>
-          <w:b/>
-          <w:color w:val="1E3A8A"/>
-          <w:sz w:val="23"/>
-        </w:rPr>
-        <w:t>SEÇÃO APÊNDICE: PLANO DE TRABALHO E DIVISÃO DE TAREFAS DA EQUIPE (VERSÃO 2.0)</w:t>
-      </w:r>
-    </w:p>
-    <w:tbl>
-      <w:tblPr>
-        <w:tblW w:type="auto" w:w="0"/>
-        <w:jc w:val="center"/>
-        <w:tblLayout w:type="fixed"/>
-        <w:tblLook w:firstColumn="1" w:firstRow="1" w:lastColumn="0" w:lastRow="0" w:noHBand="0" w:noVBand="1" w:val="04A0"/>
-      </w:tblPr>
-      <w:tblGrid>
-        <w:gridCol w:w="3312"/>
-        <w:gridCol w:w="3312"/>
-        <w:gridCol w:w="3312"/>
-      </w:tblGrid>
-      <w:tr>
-        <w:tc>
-          <w:tcPr>
-            <w:tcW w:type="dxa" w:w="2592"/>
-            <w:shd w:fill="1E3A8A"/>
-            <w:tcMar>
-              <w:top w:w="100" w:type="dxa"/>
-              <w:bottom w:w="100" w:type="dxa"/>
-              <w:left w:w="100" w:type="dxa"/>
-              <w:right w:w="100" w:type="dxa"/>
-            </w:tcMar>
-          </w:tcPr>
-          <w:p>
-            <w:pPr>
-              <w:jc w:val="center"/>
-            </w:pPr>
-            <w:r>
-              <w:rPr>
-                <w:b/>
-                <w:color w:val="FFFFFF"/>
-                <w:sz w:val="17"/>
-              </w:rPr>
-              <w:t>Discente Responsável</w:t>
-            </w:r>
-          </w:p>
-        </w:tc>
-        <w:tc>
-          <w:tcPr>
-            <w:tcW w:type="dxa" w:w="4608"/>
-            <w:shd w:fill="1E3A8A"/>
-            <w:tcMar>
-              <w:top w:w="100" w:type="dxa"/>
-              <w:bottom w:w="100" w:type="dxa"/>
-              <w:left w:w="100" w:type="dxa"/>
-              <w:right w:w="100" w:type="dxa"/>
-            </w:tcMar>
-          </w:tcPr>
-          <w:p>
-            <w:pPr>
-              <w:jc w:val="center"/>
-            </w:pPr>
-            <w:r>
-              <w:rPr>
-                <w:b/>
-                <w:color w:val="FFFFFF"/>
-                <w:sz w:val="17"/>
-              </w:rPr>
-              <w:t>Seção / Tarefa Principal Alocada (V2)</w:t>
-            </w:r>
-          </w:p>
-        </w:tc>
-        <w:tc>
-          <w:tcPr>
-            <w:tcW w:type="dxa" w:w="2592"/>
-            <w:shd w:fill="1E3A8A"/>
-            <w:tcMar>
-              <w:top w:w="100" w:type="dxa"/>
-              <w:bottom w:w="100" w:type="dxa"/>
-              <w:left w:w="100" w:type="dxa"/>
-              <w:right w:w="100" w:type="dxa"/>
-            </w:tcMar>
-          </w:tcPr>
-          <w:p>
-            <w:pPr>
-              <w:jc w:val="center"/>
-            </w:pPr>
-            <w:r>
-              <w:rPr>
-                <w:b/>
-                <w:color w:val="FFFFFF"/>
-                <w:sz w:val="17"/>
-              </w:rPr>
-              <w:t>Orientador Vinculado</w:t>
-            </w:r>
-          </w:p>
-        </w:tc>
-      </w:tr>
-      <w:tr>
-        <w:tc>
-          <w:tcPr>
-            <w:tcW w:type="dxa" w:w="2592"/>
+            <w:tcW w:type="dxa" w:w="2880"/>
             <w:shd w:fill="F0F9FF"/>
             <w:tcMar>
               <w:top w:w="80" w:type="dxa"/>
@@ -2120,13 +690,13 @@
                 <w:b/>
                 <w:sz w:val="17"/>
               </w:rPr>
-              <w:t>Josué Jofre Tomaz de Almeida</w:t>
+              <w:t>Natureza Financeira</w:t>
             </w:r>
           </w:p>
         </w:tc>
         <w:tc>
           <w:tcPr>
-            <w:tcW w:type="dxa" w:w="4608"/>
+            <w:tcW w:type="dxa" w:w="3456"/>
             <w:shd w:fill="F0F9FF"/>
             <w:tcMar>
               <w:top w:w="80" w:type="dxa"/>
@@ -2144,13 +714,13 @@
               <w:rPr>
                 <w:sz w:val="17"/>
               </w:rPr>
-              <w:t>Coordenação geral, Metodologia (X.3), Protocolo de Entrevistas com Gestores e Modelagem do Framework de Gestão (Seção X.5)</w:t>
+              <w:t>Investimento em ativo imobilizado (Capex)</w:t>
             </w:r>
           </w:p>
         </w:tc>
         <w:tc>
           <w:tcPr>
-            <w:tcW w:type="dxa" w:w="2592"/>
+            <w:tcW w:type="dxa" w:w="3456"/>
             <w:shd w:fill="F0F9FF"/>
             <w:tcMar>
               <w:top w:w="80" w:type="dxa"/>
@@ -2168,7 +738,7 @@
               <w:rPr>
                 <w:sz w:val="17"/>
               </w:rPr>
-              <w:t>Profª Drª Maria Elizete Kunkel (LabBiAT)</w:t>
+              <w:t>Despesa operacional contínua (Opex)</w:t>
             </w:r>
           </w:p>
         </w:tc>
@@ -2176,7 +746,7 @@
       <w:tr>
         <w:tc>
           <w:tcPr>
-            <w:tcW w:type="dxa" w:w="2592"/>
+            <w:tcW w:type="dxa" w:w="2880"/>
             <w:shd w:fill="FFFFFF"/>
             <w:tcMar>
               <w:top w:w="80" w:type="dxa"/>
@@ -2195,13 +765,13 @@
                 <w:b/>
                 <w:sz w:val="17"/>
               </w:rPr>
-              <w:t>Alexandre Pedroso Fernandes</w:t>
+              <w:t>Impacto Fiscal Tributário</w:t>
             </w:r>
           </w:p>
         </w:tc>
         <w:tc>
           <w:tcPr>
-            <w:tcW w:type="dxa" w:w="4608"/>
+            <w:tcW w:type="dxa" w:w="3456"/>
             <w:shd w:fill="FFFFFF"/>
             <w:tcMar>
               <w:top w:w="80" w:type="dxa"/>
@@ -2219,13 +789,13 @@
               <w:rPr>
                 <w:sz w:val="17"/>
               </w:rPr>
-              <w:t>Entrevistas com Gestores de TI/Sistemas e Análise da Dimensão Tecnológica / Compatibilidade de ERPs legados (Seção X.4.2)</w:t>
+              <w:t>Depreciação contábil lenta (5 anos)</w:t>
             </w:r>
           </w:p>
         </w:tc>
         <w:tc>
           <w:tcPr>
-            <w:tcW w:type="dxa" w:w="2592"/>
+            <w:tcW w:type="dxa" w:w="3456"/>
             <w:shd w:fill="FFFFFF"/>
             <w:tcMar>
               <w:top w:w="80" w:type="dxa"/>
@@ -2243,7 +813,7 @@
               <w:rPr>
                 <w:sz w:val="17"/>
               </w:rPr>
-              <w:t>Prof. Dr. Carlos M. Gurjão de Godoy</w:t>
+              <w:t>Dedutibilidade integral (Lucro Real 34%)</w:t>
             </w:r>
           </w:p>
         </w:tc>
@@ -2251,7 +821,7 @@
       <w:tr>
         <w:tc>
           <w:tcPr>
-            <w:tcW w:type="dxa" w:w="2592"/>
+            <w:tcW w:type="dxa" w:w="2880"/>
             <w:shd w:fill="F0F9FF"/>
             <w:tcMar>
               <w:top w:w="80" w:type="dxa"/>
@@ -2270,13 +840,13 @@
                 <w:b/>
                 <w:sz w:val="17"/>
               </w:rPr>
-              <w:t>Manuela Souza</w:t>
+              <w:t>Gestão de Manutenção</w:t>
             </w:r>
           </w:p>
         </w:tc>
         <w:tc>
           <w:tcPr>
-            <w:tcW w:type="dxa" w:w="4608"/>
+            <w:tcW w:type="dxa" w:w="3456"/>
             <w:shd w:fill="F0F9FF"/>
             <w:tcMar>
               <w:top w:w="80" w:type="dxa"/>
@@ -2294,13 +864,13 @@
               <w:rPr>
                 <w:sz w:val="17"/>
               </w:rPr>
-              <w:t>Revisão Teórica dos Frameworks de Adoção: Klein &amp; Sorra (1996), Leonard-Barton (1988) e Modelo TOE (Seção X.2.2 e X.2.4)</w:t>
+              <w:t>Reativa, desarticulada e com alto MTTR</w:t>
             </w:r>
           </w:p>
         </w:tc>
         <w:tc>
           <w:tcPr>
-            <w:tcW w:type="dxa" w:w="2592"/>
+            <w:tcW w:type="dxa" w:w="3456"/>
             <w:shd w:fill="F0F9FF"/>
             <w:tcMar>
               <w:top w:w="80" w:type="dxa"/>
@@ -2318,7 +888,7 @@
               <w:rPr>
                 <w:sz w:val="17"/>
               </w:rPr>
-              <w:t>Prof. Dr. Carlos Marcelo Gurjão de Godoy</w:t>
+              <w:t>Preventiva com SLA e Hot-swap em até 24h</w:t>
             </w:r>
           </w:p>
         </w:tc>
@@ -2326,7 +896,7 @@
       <w:tr>
         <w:tc>
           <w:tcPr>
-            <w:tcW w:type="dxa" w:w="2592"/>
+            <w:tcW w:type="dxa" w:w="2880"/>
             <w:shd w:fill="FFFFFF"/>
             <w:tcMar>
               <w:top w:w="80" w:type="dxa"/>
@@ -2345,13 +915,13 @@
                 <w:b/>
                 <w:sz w:val="17"/>
               </w:rPr>
-              <w:t>Emilie Modolo</w:t>
+              <w:t>Risco de Abandono da TA</w:t>
             </w:r>
           </w:p>
         </w:tc>
         <w:tc>
           <w:tcPr>
-            <w:tcW w:type="dxa" w:w="4608"/>
+            <w:tcW w:type="dxa" w:w="3456"/>
             <w:shd w:fill="FFFFFF"/>
             <w:tcMar>
               <w:top w:w="80" w:type="dxa"/>
@@ -2369,13 +939,13 @@
               <w:rPr>
                 <w:sz w:val="17"/>
               </w:rPr>
-              <w:t>Entrevistas com Lideranças de D&amp;I e Mapeamento dos Fluxos Decisórios de Governança Corporativa (Seção X.4.1)</w:t>
+              <w:t>Crítico (30% a 50%) arcado pelo cliente</w:t>
             </w:r>
           </w:p>
         </w:tc>
         <w:tc>
           <w:tcPr>
-            <w:tcW w:type="dxa" w:w="2592"/>
+            <w:tcW w:type="dxa" w:w="3456"/>
             <w:shd w:fill="FFFFFF"/>
             <w:tcMar>
               <w:top w:w="80" w:type="dxa"/>
@@ -2393,7 +963,7 @@
               <w:rPr>
                 <w:sz w:val="17"/>
               </w:rPr>
-              <w:t>Profª Drª Míriam Raquel Diniz Zanetti</w:t>
+              <w:t>Mitigado por suporte ergonômico contínuo</w:t>
             </w:r>
           </w:p>
         </w:tc>
@@ -2401,7 +971,7 @@
       <w:tr>
         <w:tc>
           <w:tcPr>
-            <w:tcW w:type="dxa" w:w="2592"/>
+            <w:tcW w:type="dxa" w:w="2880"/>
             <w:shd w:fill="F0F9FF"/>
             <w:tcMar>
               <w:top w:w="80" w:type="dxa"/>
@@ -2420,13 +990,13 @@
                 <w:b/>
                 <w:sz w:val="17"/>
               </w:rPr>
-              <w:t>Renata Andrea de Oliveira</w:t>
+              <w:t>Acessibilidade dos ERPs</w:t>
             </w:r>
           </w:p>
         </w:tc>
         <w:tc>
           <w:tcPr>
-            <w:tcW w:type="dxa" w:w="4608"/>
+            <w:tcW w:type="dxa" w:w="3456"/>
             <w:shd w:fill="F0F9FF"/>
             <w:tcMar>
               <w:top w:w="80" w:type="dxa"/>
@@ -2444,13 +1014,13 @@
               <w:rPr>
                 <w:sz w:val="17"/>
               </w:rPr>
-              <w:t>Entrevistas de Ergonomia/SST/RH e Análise do Clima de Implementação e Gestão da Mudança (Seção X.4.3)</w:t>
+              <w:t>Conflito crônico com sistemas legados</w:t>
             </w:r>
           </w:p>
         </w:tc>
         <w:tc>
           <w:tcPr>
-            <w:tcW w:type="dxa" w:w="2592"/>
+            <w:tcW w:type="dxa" w:w="3456"/>
             <w:shd w:fill="F0F9FF"/>
             <w:tcMar>
               <w:top w:w="80" w:type="dxa"/>
@@ -2468,7 +1038,7 @@
               <w:rPr>
                 <w:sz w:val="17"/>
               </w:rPr>
-              <w:t>Profª Drª Míriam Raquel Diniz Zanetti</w:t>
+              <w:t>Homologação e adequação de interfaces</w:t>
             </w:r>
           </w:p>
         </w:tc>
@@ -2476,7 +1046,7 @@
       <w:tr>
         <w:tc>
           <w:tcPr>
-            <w:tcW w:type="dxa" w:w="2592"/>
+            <w:tcW w:type="dxa" w:w="2880"/>
             <w:shd w:fill="FFFFFF"/>
             <w:tcMar>
               <w:top w:w="80" w:type="dxa"/>
@@ -2495,13 +1065,13 @@
                 <w:b/>
                 <w:sz w:val="17"/>
               </w:rPr>
-              <w:t>Diana Cortez</w:t>
+              <w:t>Gestão de Descarte / E-waste</w:t>
             </w:r>
           </w:p>
         </w:tc>
         <w:tc>
           <w:tcPr>
-            <w:tcW w:type="dxa" w:w="4608"/>
+            <w:tcW w:type="dxa" w:w="3456"/>
             <w:shd w:fill="FFFFFF"/>
             <w:tcMar>
               <w:top w:w="80" w:type="dxa"/>
@@ -2519,13 +1089,13 @@
               <w:rPr>
                 <w:sz w:val="17"/>
               </w:rPr>
-              <w:t>Introdução em Gestão da Inovação (X.1), Práticas de Sustentação Tecnológica (X.4.4) e Considerações Finais (Seção X.6)</w:t>
+              <w:t>Passivo ambiental sob guarda da empresa</w:t>
             </w:r>
           </w:p>
         </w:tc>
         <w:tc>
           <w:tcPr>
-            <w:tcW w:type="dxa" w:w="2592"/>
+            <w:tcW w:type="dxa" w:w="3456"/>
             <w:shd w:fill="FFFFFF"/>
             <w:tcMar>
               <w:top w:w="80" w:type="dxa"/>
@@ -2543,12 +1113,651 @@
               <w:rPr>
                 <w:sz w:val="17"/>
               </w:rPr>
-              <w:t>Profª Drª Míriam Raquel Diniz Zanetti</w:t>
+              <w:t>Economia circular gerida pelo provedor</w:t>
+            </w:r>
+          </w:p>
+        </w:tc>
+      </w:tr>
+      <w:tr>
+        <w:tc>
+          <w:tcPr>
+            <w:tcW w:type="dxa" w:w="2880"/>
+            <w:shd w:fill="F0F9FF"/>
+            <w:tcMar>
+              <w:top w:w="80" w:type="dxa"/>
+              <w:bottom w:w="80" w:type="dxa"/>
+              <w:left w:w="100" w:type="dxa"/>
+              <w:right w:w="100" w:type="dxa"/>
+            </w:tcMar>
+          </w:tcPr>
+          <w:p>
+            <w:pPr>
+              <w:spacing w:line="276" w:lineRule="auto"/>
+              <w:jc w:val="left"/>
+            </w:pPr>
+            <w:r>
+              <w:rPr>
+                <w:b/>
+                <w:sz w:val="17"/>
+              </w:rPr>
+              <w:t>Governança de Privacidade</w:t>
+            </w:r>
+          </w:p>
+        </w:tc>
+        <w:tc>
+          <w:tcPr>
+            <w:tcW w:type="dxa" w:w="3456"/>
+            <w:shd w:fill="F0F9FF"/>
+            <w:tcMar>
+              <w:top w:w="80" w:type="dxa"/>
+              <w:bottom w:w="80" w:type="dxa"/>
+              <w:left w:w="100" w:type="dxa"/>
+              <w:right w:w="100" w:type="dxa"/>
+            </w:tcMar>
+          </w:tcPr>
+          <w:p>
+            <w:pPr>
+              <w:spacing w:line="276" w:lineRule="auto"/>
+              <w:jc w:val="left"/>
+            </w:pPr>
+            <w:r>
+              <w:rPr>
+                <w:sz w:val="17"/>
+              </w:rPr>
+              <w:t>Descentralizada e suscetível a vazamentos</w:t>
+            </w:r>
+          </w:p>
+        </w:tc>
+        <w:tc>
+          <w:tcPr>
+            <w:tcW w:type="dxa" w:w="3456"/>
+            <w:shd w:fill="F0F9FF"/>
+            <w:tcMar>
+              <w:top w:w="80" w:type="dxa"/>
+              <w:bottom w:w="80" w:type="dxa"/>
+              <w:left w:w="100" w:type="dxa"/>
+              <w:right w:w="100" w:type="dxa"/>
+            </w:tcMar>
+          </w:tcPr>
+          <w:p>
+            <w:pPr>
+              <w:spacing w:line="276" w:lineRule="auto"/>
+              <w:jc w:val="left"/>
+            </w:pPr>
+            <w:r>
+              <w:rPr>
+                <w:sz w:val="17"/>
+              </w:rPr>
+              <w:t>Protocolos formais Privacy-by-Design / LGPD</w:t>
             </w:r>
           </w:p>
         </w:tc>
       </w:tr>
     </w:tbl>
+    <w:p>
+      <w:pPr>
+        <w:spacing w:after="80"/>
+      </w:pPr>
+    </w:p>
+    <w:p>
+      <w:pPr>
+        <w:keepNext/>
+        <w:spacing w:before="240" w:after="80"/>
+      </w:pPr>
+      <w:r>
+        <w:rPr>
+          <w:rFonts w:ascii="Calibri" w:hAnsi="Calibri"/>
+          <w:b/>
+          <w:color w:val="0E7490"/>
+          <w:sz w:val="22"/>
+        </w:rPr>
+        <w:t xml:space="preserve">4.3 </w:t>
+      </w:r>
+      <w:r>
+        <w:rPr>
+          <w:rFonts w:ascii="Calibri" w:hAnsi="Calibri"/>
+          <w:b/>
+          <w:color w:val="1E293B"/>
+          <w:sz w:val="22"/>
+        </w:rPr>
+        <w:t>Governança de Cibersegurança e Privacidade sob a LGPD</w:t>
+      </w:r>
+    </w:p>
+    <w:p>
+      <w:pPr>
+        <w:spacing w:after="120" w:line="300" w:lineRule="auto"/>
+        <w:jc w:val="both"/>
+      </w:pPr>
+      <w:r>
+        <w:rPr>
+          <w:rFonts w:ascii="Calibri" w:hAnsi="Calibri"/>
+          <w:color w:val="334155"/>
+          <w:sz w:val="20"/>
+        </w:rPr>
+        <w:t>Para assegurar conformidade estrita com o art. 11 da Lei nº 13.709/2018 (LGPD), o framework institui o isolamento rigoroso entre a telemetria técnica de manutenção do hardware e os dados biométricos/comportamentais do trabalhador com deficiência. A coleta restringe-se a métricas de integridade de componentes eletrônicos, sendo terminantemente vedada a vigilância de produtividade ou perfilamento discriminatório.</w:t>
+      </w:r>
+    </w:p>
+    <w:p>
+      <w:pPr>
+        <w:keepNext/>
+        <w:spacing w:before="320" w:after="120"/>
+      </w:pPr>
+      <w:r>
+        <w:rPr>
+          <w:rFonts w:ascii="Calibri" w:hAnsi="Calibri"/>
+          <w:b/>
+          <w:color w:val="0284C7"/>
+          <w:sz w:val="26"/>
+        </w:rPr>
+        <w:t xml:space="preserve">SEÇÃO 5 </w:t>
+      </w:r>
+      <w:r>
+        <w:rPr>
+          <w:rFonts w:ascii="Calibri" w:hAnsi="Calibri"/>
+          <w:b/>
+          <w:color w:val="0F172A"/>
+          <w:sz w:val="26"/>
+        </w:rPr>
+        <w:t>FRAMEWORK INTEGRADOR DE GESTÃO DA INOVAÇÃO ASSISTIVA BASEADO EM ATAAS</w:t>
+      </w:r>
+    </w:p>
+    <w:p>
+      <w:pPr>
+        <w:spacing w:after="120" w:line="300" w:lineRule="auto"/>
+        <w:jc w:val="both"/>
+      </w:pPr>
+      <w:r>
+        <w:rPr>
+          <w:rFonts w:ascii="Calibri" w:hAnsi="Calibri"/>
+          <w:color w:val="334155"/>
+          <w:sz w:val="20"/>
+        </w:rPr>
+        <w:t>O modelo organiza-se em quatro fases articuladas: (1) Prospecção &amp; Decisão TCU; (2) Mútua Adaptação &amp; Acessibilidade Sistêmica; (3) Clima de Implementação &amp; Capacitação; e (4) Governança de SLA &amp; Economia Circular. Os KPIs contratuais estabelecem: Uptime de disponibilidade ≥ 98,5%, MTTR com substituição emergencial (hot-swap) ≤ 24 horas, e taxa de abandono tecnológico inferior a 5% em 12 meses.</w:t>
+      </w:r>
+    </w:p>
+    <w:p>
+      <w:pPr>
+        <w:spacing w:before="120"/>
+      </w:pPr>
+    </w:p>
+    <w:p>
+      <w:r>
+        <w:drawing>
+          <wp:inline xmlns:a="http://schemas.openxmlformats.org/drawingml/2006/main" xmlns:pic="http://schemas.openxmlformats.org/drawingml/2006/picture">
+            <wp:extent cx="6035040" cy="2889043"/>
+            <wp:docPr id="2" name="Picture 2"/>
+            <wp:cNvGraphicFramePr>
+              <a:graphicFrameLocks noChangeAspect="1"/>
+            </wp:cNvGraphicFramePr>
+            <a:graphic>
+              <a:graphicData uri="http://schemas.openxmlformats.org/drawingml/2006/picture">
+                <pic:pic>
+                  <pic:nvPicPr>
+                    <pic:cNvPr id="0" name="figura2_framework_ataas_v5.png"/>
+                    <pic:cNvPicPr/>
+                  </pic:nvPicPr>
+                  <pic:blipFill>
+                    <a:blip r:embed="rId10"/>
+                    <a:stretch>
+                      <a:fillRect/>
+                    </a:stretch>
+                  </pic:blipFill>
+                  <pic:spPr>
+                    <a:xfrm>
+                      <a:off x="0" y="0"/>
+                      <a:ext cx="6035040" cy="2889043"/>
+                    </a:xfrm>
+                    <a:prstGeom prst="rect"/>
+                  </pic:spPr>
+                </pic:pic>
+              </a:graphicData>
+            </a:graphic>
+          </wp:inline>
+        </w:drawing>
+      </w:r>
+    </w:p>
+    <w:p>
+      <w:pPr>
+        <w:spacing w:after="200"/>
+        <w:jc w:val="center"/>
+      </w:pPr>
+      <w:r>
+        <w:rPr>
+          <w:i/>
+          <w:color w:val="64748B"/>
+          <w:sz w:val="17"/>
+        </w:rPr>
+        <w:t>Figura 2: Framework de Gestão da Inovação Assistiva Corporativa Baseado em ATaaS (Versão 5.0).</w:t>
+        <w:br/>
+        <w:t>Fonte: Elaborado pelos autores (2026).</w:t>
+      </w:r>
+    </w:p>
+    <w:p>
+      <w:pPr>
+        <w:keepNext/>
+        <w:spacing w:before="320" w:after="120"/>
+      </w:pPr>
+      <w:r>
+        <w:rPr>
+          <w:rFonts w:ascii="Calibri" w:hAnsi="Calibri"/>
+          <w:b/>
+          <w:color w:val="0284C7"/>
+          <w:sz w:val="26"/>
+        </w:rPr>
+        <w:t xml:space="preserve">SEÇÃO 6 </w:t>
+      </w:r>
+      <w:r>
+        <w:rPr>
+          <w:rFonts w:ascii="Calibri" w:hAnsi="Calibri"/>
+          <w:b/>
+          <w:color w:val="0F172A"/>
+          <w:sz w:val="26"/>
+        </w:rPr>
+        <w:t>CONSIDERAÇÕES FINAIS, LIMITAÇÕES E AGENDA FUTURA</w:t>
+      </w:r>
+    </w:p>
+    <w:p>
+      <w:pPr>
+        <w:spacing w:after="120" w:line="300" w:lineRule="auto"/>
+        <w:jc w:val="both"/>
+      </w:pPr>
+      <w:r>
+        <w:rPr>
+          <w:rFonts w:ascii="Calibri" w:hAnsi="Calibri"/>
+          <w:color w:val="334155"/>
+          <w:sz w:val="20"/>
+        </w:rPr>
+        <w:t>Este estudo consolida uma contribuição seminal ao unir a Servitização e os Sistemas Produto-Serviço à gestão de Tecnologias Assistivas no trabalho. Teoricamente, estende a S-D Logic e o modelo MPT ao campo organizacional, demonstrando como a modularidade supera o Paradoxo da Servitização. Gerencialmente, instrumentaliza a migração de Capex para Opex com respaldo tributário e métricas concretas de sustentabilidade ESG (ODS 8 e 10).</w:t>
+      </w:r>
+    </w:p>
+    <w:p>
+      <w:pPr>
+        <w:spacing w:after="120" w:line="300" w:lineRule="auto"/>
+        <w:jc w:val="both"/>
+      </w:pPr>
+      <w:r>
+        <w:rPr>
+          <w:rFonts w:ascii="Calibri" w:hAnsi="Calibri"/>
+          <w:b/>
+          <w:color w:val="0F172A"/>
+          <w:sz w:val="20"/>
+        </w:rPr>
+        <w:t xml:space="preserve">Condições de Contorno e Limitações: </w:t>
+      </w:r>
+      <w:r>
+        <w:rPr>
+          <w:rFonts w:ascii="Calibri" w:hAnsi="Calibri"/>
+          <w:color w:val="334155"/>
+          <w:sz w:val="20"/>
+        </w:rPr>
+        <w:t>Limitações do Trabalho: (1) Validade ecológica delimitada pelo marco regulatório coercitivo brasileiro (Lei nº 8.213/1991), demandando cautela na extrapolação para mercados voluntários internacionais; (2) Desenho de corte transversal que impede aferição de causalidade de longo prazo (&gt; 5 anos); (3) Fronteira de amortização contábil de TCU em horizontes superiores a 60 meses para hardware hiperdurável; e (4) Risco de viés de desejabilidade social nos questionários de RH.</w:t>
+      </w:r>
+    </w:p>
+    <w:p>
+      <w:pPr>
+        <w:spacing w:after="120" w:line="300" w:lineRule="auto"/>
+        <w:jc w:val="both"/>
+      </w:pPr>
+      <w:r>
+        <w:rPr>
+          <w:rFonts w:ascii="Calibri" w:hAnsi="Calibri"/>
+          <w:b/>
+          <w:color w:val="0F172A"/>
+          <w:sz w:val="20"/>
+        </w:rPr>
+        <w:t xml:space="preserve">Hipóteses para Pesquisa Futura: </w:t>
+      </w:r>
+      <w:r>
+        <w:rPr>
+          <w:rFonts w:ascii="Calibri" w:hAnsi="Calibri"/>
+          <w:color w:val="334155"/>
+          <w:sz w:val="20"/>
+        </w:rPr>
+        <w:t>Para orientar investigações confirmatórias futuras via modelagem de equações estruturais (PLS-SEM), formulam-se formalmente três hipóteses de pesquisa:</w:t>
+        <w:br/>
+        <w:t>• H1: A interoperabilidade prévia entre o ecossistema ATaaS e sistemas ERPs corporativos modera positivamente a relação entre servitização e redução do abandono da TA.</w:t>
+        <w:br/>
+        <w:t>• H2: A governança Privacy by Design sob a LGPD atua como preditor direto do Clima de Implementação e do engajamento do colaborador.</w:t>
+        <w:br/>
+        <w:t>• H3: A percepção de perda de controle técnico (vendor lock-in) atua como determinante negativo na decisão executiva de migração para o ATaaS.</w:t>
+      </w:r>
+    </w:p>
+    <w:p>
+      <w:pPr>
+        <w:keepNext/>
+        <w:spacing w:before="320" w:after="120"/>
+      </w:pPr>
+      <w:r>
+        <w:rPr>
+          <w:rFonts w:ascii="Calibri" w:hAnsi="Calibri"/>
+          <w:b/>
+          <w:color w:val="0284C7"/>
+          <w:sz w:val="26"/>
+        </w:rPr>
+        <w:t xml:space="preserve">REFERÊNCIAS </w:t>
+      </w:r>
+      <w:r>
+        <w:rPr>
+          <w:rFonts w:ascii="Calibri" w:hAnsi="Calibri"/>
+          <w:b/>
+          <w:color w:val="0F172A"/>
+          <w:sz w:val="26"/>
+        </w:rPr>
+        <w:t>REFERÊNCIAS BIBLIOGRÁFICAS NORMATIZADAS (ABNT NBR 6023)</w:t>
+      </w:r>
+    </w:p>
+    <w:p>
+      <w:pPr>
+        <w:spacing w:after="60" w:line="276" w:lineRule="auto"/>
+      </w:pPr>
+      <w:r>
+        <w:rPr>
+          <w:rFonts w:ascii="Calibri" w:hAnsi="Calibri"/>
+          <w:color w:val="334155"/>
+          <w:sz w:val="17"/>
+        </w:rPr>
+        <w:t>BAINES, T. S. et al. State-of-the-art in product-service systems. International Journal of Production Research, v. 45, n. 10, p. 2471–2489, 2009.</w:t>
+      </w:r>
+    </w:p>
+    <w:p>
+      <w:pPr>
+        <w:spacing w:after="60" w:line="276" w:lineRule="auto"/>
+      </w:pPr>
+      <w:r>
+        <w:rPr>
+          <w:rFonts w:ascii="Calibri" w:hAnsi="Calibri"/>
+          <w:color w:val="334155"/>
+          <w:sz w:val="17"/>
+        </w:rPr>
+        <w:t>BARDIN, L. Análise de conteúdo. São Paulo: Edições 70, 2016.</w:t>
+      </w:r>
+    </w:p>
+    <w:p>
+      <w:pPr>
+        <w:spacing w:after="60" w:line="276" w:lineRule="auto"/>
+      </w:pPr>
+      <w:r>
+        <w:rPr>
+          <w:rFonts w:ascii="Calibri" w:hAnsi="Calibri"/>
+          <w:color w:val="334155"/>
+          <w:sz w:val="17"/>
+        </w:rPr>
+        <w:t>BASK, A. et al. Service modularity and modular service offerings. Service Science, v. 2, n. 4, p. 219–237, 2010.</w:t>
+      </w:r>
+    </w:p>
+    <w:p>
+      <w:pPr>
+        <w:spacing w:after="60" w:line="276" w:lineRule="auto"/>
+      </w:pPr>
+      <w:r>
+        <w:rPr>
+          <w:rFonts w:ascii="Calibri" w:hAnsi="Calibri"/>
+          <w:color w:val="334155"/>
+          <w:sz w:val="17"/>
+        </w:rPr>
+        <w:t>BRASIL. Lei nº 8.213, de 24 de julho de 1991. Dispõe sobre os Planos de Benefícios da Previdência Social e dá outras providências [Lei de Cotas]. Brasília, DF: Presidência da República, 1991.</w:t>
+      </w:r>
+    </w:p>
+    <w:p>
+      <w:pPr>
+        <w:spacing w:after="60" w:line="276" w:lineRule="auto"/>
+      </w:pPr>
+      <w:r>
+        <w:rPr>
+          <w:rFonts w:ascii="Calibri" w:hAnsi="Calibri"/>
+          <w:color w:val="334155"/>
+          <w:sz w:val="17"/>
+        </w:rPr>
+        <w:t>BRASIL. Lei nº 13.146, de 6 de julho de 2015. Institui a Lei Brasileira de Inclusão da Pessoa com Deficiência. Brasília, DF: Presidência da República, 2015.</w:t>
+      </w:r>
+    </w:p>
+    <w:p>
+      <w:pPr>
+        <w:spacing w:after="60" w:line="276" w:lineRule="auto"/>
+      </w:pPr>
+      <w:r>
+        <w:rPr>
+          <w:rFonts w:ascii="Calibri" w:hAnsi="Calibri"/>
+          <w:color w:val="334155"/>
+          <w:sz w:val="17"/>
+        </w:rPr>
+        <w:t>BRASIL. Lei nº 13.709, de 14 de agosto de 2018. Dispõe sobre a proteção de dados pessoais (LGPD). Brasília, DF: Presidência da República, 2018.</w:t>
+      </w:r>
+    </w:p>
+    <w:p>
+      <w:pPr>
+        <w:spacing w:after="60" w:line="276" w:lineRule="auto"/>
+      </w:pPr>
+      <w:r>
+        <w:rPr>
+          <w:rFonts w:ascii="Calibri" w:hAnsi="Calibri"/>
+          <w:color w:val="334155"/>
+          <w:sz w:val="17"/>
+        </w:rPr>
+        <w:t>CHESBROUGH, H. Open Innovation: The New Imperative for Creating and Profiting from Technology. Boston: Harvard Business School Press, 2003.</w:t>
+      </w:r>
+    </w:p>
+    <w:p>
+      <w:pPr>
+        <w:spacing w:after="60" w:line="276" w:lineRule="auto"/>
+      </w:pPr>
+      <w:r>
+        <w:rPr>
+          <w:rFonts w:ascii="Calibri" w:hAnsi="Calibri"/>
+          <w:color w:val="334155"/>
+          <w:sz w:val="17"/>
+        </w:rPr>
+        <w:t>CRESWELL, J. W.; PLANO CLARK, V. L. Designing and Conducting Mixed Methods Research. 3. ed. Thousand Oaks: SAGE Publications, 2018.</w:t>
+      </w:r>
+    </w:p>
+    <w:p>
+      <w:pPr>
+        <w:spacing w:after="60" w:line="276" w:lineRule="auto"/>
+      </w:pPr>
+      <w:r>
+        <w:rPr>
+          <w:rFonts w:ascii="Calibri" w:hAnsi="Calibri"/>
+          <w:color w:val="334155"/>
+          <w:sz w:val="17"/>
+        </w:rPr>
+        <w:t>GEBAUER, H.; FLEISCH, E.; FRIEDLI, T. Overcoming the service paradox in manufacturing companies. European Management Journal, v. 23, n. 1, p. 14–26, 2005.</w:t>
+      </w:r>
+    </w:p>
+    <w:p>
+      <w:pPr>
+        <w:spacing w:after="60" w:line="276" w:lineRule="auto"/>
+      </w:pPr>
+      <w:r>
+        <w:rPr>
+          <w:rFonts w:ascii="Calibri" w:hAnsi="Calibri"/>
+          <w:color w:val="334155"/>
+          <w:sz w:val="17"/>
+        </w:rPr>
+        <w:t>KLEIN, K. J.; SORRA, J. S. The challenge of innovation implementation. Academy of Management Review, v. 21, n. 4, p. 1055–1080, 1996.</w:t>
+      </w:r>
+    </w:p>
+    <w:p>
+      <w:pPr>
+        <w:spacing w:after="60" w:line="276" w:lineRule="auto"/>
+      </w:pPr>
+      <w:r>
+        <w:rPr>
+          <w:rFonts w:ascii="Calibri" w:hAnsi="Calibri"/>
+          <w:color w:val="334155"/>
+          <w:sz w:val="17"/>
+        </w:rPr>
+        <w:t>KOWALKOWSKI, C.; GEBAUER, H.; OLIVA, R. Service growth in product firms: Emerging perspectives. Journal of Service Management, v. 28, n. 1, p. 2–18, 2017.</w:t>
+      </w:r>
+    </w:p>
+    <w:p>
+      <w:pPr>
+        <w:spacing w:after="60" w:line="276" w:lineRule="auto"/>
+      </w:pPr>
+      <w:r>
+        <w:rPr>
+          <w:rFonts w:ascii="Calibri" w:hAnsi="Calibri"/>
+          <w:color w:val="334155"/>
+          <w:sz w:val="17"/>
+        </w:rPr>
+        <w:t>LEONARD-BARTON, D. Implementation as mutual adaptation of technology and organization. Research Policy, v. 17, n. 5, p. 251–267, 1988.</w:t>
+      </w:r>
+    </w:p>
+    <w:p>
+      <w:pPr>
+        <w:spacing w:after="60" w:line="276" w:lineRule="auto"/>
+      </w:pPr>
+      <w:r>
+        <w:rPr>
+          <w:rFonts w:ascii="Calibri" w:hAnsi="Calibri"/>
+          <w:color w:val="334155"/>
+          <w:sz w:val="17"/>
+        </w:rPr>
+        <w:t>ORGANIZAÇÃO DAS NAÇÕES UNIDAS (ONU). Transformando Nosso Mundo: A Agenda 2030 para o Desenvolvimento Sustentável. Nova York: Nações Unidas, 2015.</w:t>
+      </w:r>
+    </w:p>
+    <w:p>
+      <w:pPr>
+        <w:spacing w:after="60" w:line="276" w:lineRule="auto"/>
+      </w:pPr>
+      <w:r>
+        <w:rPr>
+          <w:rFonts w:ascii="Calibri" w:hAnsi="Calibri"/>
+          <w:color w:val="334155"/>
+          <w:sz w:val="17"/>
+        </w:rPr>
+        <w:t>OSTERWALDER, A.; PIGNEUR, Y. Business Model Generation: Inovação em Modelos de Negócios. Rio de Janeiro: Alta Books, 2010.</w:t>
+      </w:r>
+    </w:p>
+    <w:p>
+      <w:pPr>
+        <w:spacing w:after="60" w:line="276" w:lineRule="auto"/>
+      </w:pPr>
+      <w:r>
+        <w:rPr>
+          <w:rFonts w:ascii="Calibri" w:hAnsi="Calibri"/>
+          <w:color w:val="334155"/>
+          <w:sz w:val="17"/>
+        </w:rPr>
+        <w:t>PAGE, M. J. et al. The PRISMA 2020 statement: an updated guideline for reporting systematic reviews. BMJ, v. 372, n. n71, 2021.</w:t>
+      </w:r>
+    </w:p>
+    <w:p>
+      <w:pPr>
+        <w:spacing w:after="60" w:line="276" w:lineRule="auto"/>
+      </w:pPr>
+      <w:r>
+        <w:rPr>
+          <w:rFonts w:ascii="Calibri" w:hAnsi="Calibri"/>
+          <w:color w:val="334155"/>
+          <w:sz w:val="17"/>
+        </w:rPr>
+        <w:t>PISANO, G. P. You need an innovation strategy. Harvard Business Review, v. 93, n. 6, p. 44–54, 2015.</w:t>
+      </w:r>
+    </w:p>
+    <w:p>
+      <w:pPr>
+        <w:spacing w:after="60" w:line="276" w:lineRule="auto"/>
+      </w:pPr>
+      <w:r>
+        <w:rPr>
+          <w:rFonts w:ascii="Calibri" w:hAnsi="Calibri"/>
+          <w:color w:val="334155"/>
+          <w:sz w:val="17"/>
+        </w:rPr>
+        <w:t>SCHERER, M. J. Assessing the benefits of using assistive technologies and other accommodations in education and the workplace. Disability and Rehabilitation, v. 27, n. 21, p. 1327–1339, 2005.</w:t>
+      </w:r>
+    </w:p>
+    <w:p>
+      <w:pPr>
+        <w:spacing w:after="60" w:line="276" w:lineRule="auto"/>
+      </w:pPr>
+      <w:r>
+        <w:rPr>
+          <w:rFonts w:ascii="Calibri" w:hAnsi="Calibri"/>
+          <w:color w:val="334155"/>
+          <w:sz w:val="17"/>
+        </w:rPr>
+        <w:t>SUGAWARA, A. T. et al. Abandonment of assistive technology in Brazil: study of associated factors. Brazilian Journal of Physical Therapy, v. 22, n. 5, p. 401–407, 2018.</w:t>
+      </w:r>
+    </w:p>
+    <w:p>
+      <w:pPr>
+        <w:spacing w:after="60" w:line="276" w:lineRule="auto"/>
+      </w:pPr>
+      <w:r>
+        <w:rPr>
+          <w:rFonts w:ascii="Calibri" w:hAnsi="Calibri"/>
+          <w:color w:val="334155"/>
+          <w:sz w:val="17"/>
+        </w:rPr>
+        <w:t>TEECE, D. J. Business models, business strategy and innovation. Long Range Planning, v. 43, n. 2–3, p. 172–194, 2010.</w:t>
+      </w:r>
+    </w:p>
+    <w:p>
+      <w:pPr>
+        <w:spacing w:after="60" w:line="276" w:lineRule="auto"/>
+      </w:pPr>
+      <w:r>
+        <w:rPr>
+          <w:rFonts w:ascii="Calibri" w:hAnsi="Calibri"/>
+          <w:color w:val="334155"/>
+          <w:sz w:val="17"/>
+        </w:rPr>
+        <w:t>TIDD, J.; BESSANT, J. Gestão da Inovação. 5. ed. Porto Alegre: Bookman, 2015.</w:t>
+      </w:r>
+    </w:p>
+    <w:p>
+      <w:pPr>
+        <w:spacing w:after="60" w:line="276" w:lineRule="auto"/>
+      </w:pPr>
+      <w:r>
+        <w:rPr>
+          <w:rFonts w:ascii="Calibri" w:hAnsi="Calibri"/>
+          <w:color w:val="334155"/>
+          <w:sz w:val="17"/>
+        </w:rPr>
+        <w:t>TORNATZKY, L. G.; FLEISCHER, M. The Processes of Technological Innovation. Lexington: Lexington Books, 1990.</w:t>
+      </w:r>
+    </w:p>
+    <w:p>
+      <w:pPr>
+        <w:spacing w:after="60" w:line="276" w:lineRule="auto"/>
+      </w:pPr>
+      <w:r>
+        <w:rPr>
+          <w:rFonts w:ascii="Calibri" w:hAnsi="Calibri"/>
+          <w:color w:val="334155"/>
+          <w:sz w:val="17"/>
+        </w:rPr>
+        <w:t>TUKKER, A. Eight types of product-service system: eight ways to sustainability? Business Strategy and the Environment, v. 13, n. 4, p. 246–260, 2004.</w:t>
+      </w:r>
+    </w:p>
+    <w:p>
+      <w:pPr>
+        <w:spacing w:after="60" w:line="276" w:lineRule="auto"/>
+      </w:pPr>
+      <w:r>
+        <w:rPr>
+          <w:rFonts w:ascii="Calibri" w:hAnsi="Calibri"/>
+          <w:color w:val="334155"/>
+          <w:sz w:val="17"/>
+        </w:rPr>
+        <w:t>VANDERMERWE, S.; RADA, J. Servitization of business: adding value by adding services. European Management Journal, v. 6, n. 4, p. 314–324, 1988.</w:t>
+      </w:r>
+    </w:p>
+    <w:p>
+      <w:pPr>
+        <w:spacing w:after="60" w:line="276" w:lineRule="auto"/>
+      </w:pPr>
+      <w:r>
+        <w:rPr>
+          <w:rFonts w:ascii="Calibri" w:hAnsi="Calibri"/>
+          <w:color w:val="334155"/>
+          <w:sz w:val="17"/>
+        </w:rPr>
+        <w:t>VARGO, S. L.; LUSCH, R. F. Service-dominant logic: continuing the evolution. Journal of the Academy of Marketing Science, v. 44, n. 1, p. 5–23, 2016.</w:t>
+      </w:r>
+    </w:p>
     <w:sectPr>
       <w:pgSz w:w="12240" w:h="15840"/>
       <w:pgMar w:top="1152" w:right="1152" w:bottom="1152" w:left="1152" w:header="720" w:footer="720" w:gutter="0"/>

</xml_diff>

<commit_message>
fix(capitulo): alinhamento de equipe - Manuela Lima, docentes, foco Brasil, mapeamento bibliográfico e diretrizes PSS/MPT
</commit_message>
<xml_diff>
--- a/03 - Minutas e Redação/Proposta_Capitulo_Livro_Tecnologias_Assistivas.docx
+++ b/03 - Minutas e Redação/Proposta_Capitulo_Livro_Tecnologias_Assistivas.docx
@@ -37,7 +37,7 @@
         <w:br/>
         <w:t>Coletânea Oficial: Série Práticas de Gestão da Inovação Tecnológica (Editora Pimenta Cultural &amp; Unitau)</w:t>
         <w:br/>
-        <w:t>STATUS: VERSÃO 5.0 DEFINITIVA (APÓS REVISÃO MAIOR RIGOR 10/10 QUALIS A1)</w:t>
+        <w:t>STATUS: VERSÃO 5.0 AJUSTADA (FOCO BRASIL • ESTADO DA ARTE • ADAPTAÇÃO PSS &amp; MPT)</w:t>
       </w:r>
     </w:p>
     <w:p>
@@ -50,11 +50,11 @@
           <w:rFonts w:ascii="Calibri" w:hAnsi="Calibri"/>
           <w:b/>
           <w:color w:val="1E3A8A"/>
-          <w:sz w:val="28"/>
+          <w:sz w:val="26"/>
         </w:rPr>
         <w:t>DA AQUISIÇÃO TRANSACIONAL À SERVITIZAÇÃO CONTÍNUA:</w:t>
         <w:br/>
-        <w:t>GESTÃO ESTRATÉGICA DA INOVAÇÃO, NOVOS MODELOS DE NEGÓCIO EM TECNOLOGIAS ASSISTIVAS (ATaaS) E OS ODS 8 E 10</w:t>
+        <w:t>GESTÃO ESTRATÉGICA DA INOVAÇÃO, NOVOS MODELOS DE NEGÓCIO EM TECNOLOGIAS ASSISTIVAS (ATaaS) NO CONTEXTO CORPORATIVO BRASILEIRO E OS ODS 8 E 10</w:t>
       </w:r>
     </w:p>
     <w:p>
@@ -67,9 +67,9 @@
           <w:rFonts w:ascii="Calibri" w:hAnsi="Calibri"/>
           <w:i/>
           <w:color w:val="475569"/>
-          <w:sz w:val="20"/>
+          <w:sz w:val="19"/>
         </w:rPr>
-        <w:t>From Transactional Procurement to Continuous Servitization: Strategic Innovation Management, Novel Assistive Technology Business Models (ATaaS), and SDGs 8 &amp; 10</w:t>
+        <w:t>From Transactional Procurement to Continuous Servitization: Strategic Innovation Management, Novel Assistive Technology Business Models (ATaaS) in the Brazilian Corporate Context, and SDGs 8 &amp; 10</w:t>
       </w:r>
     </w:p>
     <w:p>
@@ -83,11 +83,11 @@
           <w:color w:val="64748B"/>
           <w:sz w:val="17"/>
         </w:rPr>
-        <w:t>Discentes: Josué Jofre, Alexandre Fernandes, Diana Cortez, Emilie Modolo, Manuela Souza, Renata Oliveira</w:t>
+        <w:t>Discentes: Josué Jofre, Alexandre Fernandes, Diana Cortez, Emilie Modolo, Manuela Lima, Renata Oliveira</w:t>
         <w:br/>
         <w:t>Docentes Orientadores: Profª Drª Maria Elizete Kunkel (LabBiAT), Profª Drª Míriam Raquel Zanetti, Prof. Dr. Carlos M. Gurjão de Godoy</w:t>
         <w:br/>
-        <w:t>Docentes da Disciplina: Prof. Dr. Antônio Yukio Ueta, Profª Drª Iraci de Souza João, Prof. Dr. Fábio Luís Falchi de Magalhães</w:t>
+        <w:t>Docentes da Disciplina: Prof. Dr. Antônio Yukio Ueta, Profª Drª Iraci de Souza João</w:t>
       </w:r>
     </w:p>
     <w:tbl>
@@ -129,7 +129,7 @@
                 <w:color w:val="0284C7"/>
                 <w:sz w:val="21"/>
               </w:rPr>
-              <w:t>PARECER EDITORIAL FINAL JSISTM: APROVADO APÓS REVISÃO MAIOR</w:t>
+              <w:t>PROPOSTA ESTRUTURADA DE CAPÍTULO DE LIVRO (GETI 2026)</w:t>
               <w:br/>
             </w:r>
             <w:r>
@@ -139,7 +139,7 @@
                 <w:color w:val="1E293B"/>
                 <w:sz w:val="19"/>
               </w:rPr>
-              <w:t>Este manuscrito reflete a Versão 5.0 Definitiva, aprovada após processo editorial simulado em nível Qualis A1 com rigor 10/10. Foram incorporados: o protocolo internacional PRISMA 2020 para a RSL (19 artigos seminais); a fundamentação teórica em Service-Dominant Logic (Vargo &amp; Lusch) e modelo Matching Person &amp; Technology (Scherer); a resolução analítica do Paradoxo da Servitização (Gebauer et al.); a modelagem comparativa de Custo Total de Uso (TCU) com dedução fiscal no Lucro Real; e o protocolo Privacy by Design sob a LGPD (art. 11).</w:t>
+              <w:t>Este manuscrito reflete a Versão 5.0 Ajustada, fundamentando-se no estado da arte da literatura internacional e nacional (19 artigos seminais com PDFs no repositório), na Service-Dominant Logic (Vargo &amp; Lusch), no modelo Matching Person &amp; Technology (Scherer), na adaptação dos modelos seminais de PSS (Tukker; Baines), na modelagem de Custo Total de Uso (TCU) no Lucro Real e na governança Privacy by Design sob a LGPD (art. 11).</w:t>
             </w:r>
           </w:p>
         </w:tc>
@@ -194,7 +194,7 @@
           <w:color w:val="334155"/>
           <w:sz w:val="20"/>
         </w:rPr>
-        <w:t>Historicamente, a incorporação de Tecnologias Assistivas (TA) no ecossistema corporativo brasileiro tem se caracterizado por uma lógica de aquisição transacional e pontual balizada em despesas de capital (Capex), induzida predominantemente pela conformidade coercitiva à Lei de Cotas (Lei nº 8.213/1991). Esse modelo estático invariavelmente culmina em assimetria na manutenção, incompatibilidade crônica com sistemas legados de Enterprise Resource Planning (ERP) e taxas elevadas de abandono tecnológico precoce (30% a 50%), comprometendo a retenção e o desenvolvimento de colaboradores com deficiência. Sob a lente da Gestão Estratégica da Inovação e da Teoria dos Sistemas Produto-Serviço (PSS), este estudo analisa a transição paradigmática da posse patrimonial para modelos de Servitização Contínua, operacionalizados pelo constructo de Tecnologia Assistiva como Serviço (ATaaS). Metodologicamente, emprega-se uma abordagem mista triangulada fundamentada no protocolo PRISMA 2020 (19 artigos incluídos), survey de prontidão e entrevistas com análise categorial de Bardin. Os resultados revelam que a viabilidade econômica do ATaaS ancora-se na otimização do Custo Total de Uso (TCU) e em benefícios fiscais no Lucro Real (34%), enquanto sua eficácia biopsicossocial depende da governança de dados (Privacy by Design sob a LGPD) e de acordos de nível de serviço com substituição emergencial (hot-swap em até 24h, Uptime ≥ 98,5%).</w:t>
+        <w:t>Historicamente, a incorporação de Tecnologias Assistivas (TA) no ecossistema corporativo brasileiro tem se caracterizado por uma lógica de aquisição transacional e pontual balizada em despesas de capital (Capex), induzida predominantemente pela conformidade coercitiva à Lei de Cotas (Lei nº 8.213/1991). Esse modelo estático invariavelmente culmina em assimetria na manutenção, incompatibilidade crônica com sistemas legados de Enterprise Resource Planning (ERP) e taxas elevadas de abandono tecnológico precoce (30% a 50%), comprometendo a retenção e o desenvolvimento de colaboradores com deficiência (Scherer, 2005; Sugawara et al., 2018). Sob a lente da Gestão Estratégica da Inovação e da Teoria dos Sistemas Produto-Serviço (PSS), este estudo analisa a transição paradigmática da posse patrimonial para modelos de Servitização Contínua, operacionalizados pelo constructo de Tecnologia Assistiva como Serviço (ATaaS). Metodologicamente, emprega-se uma abordagem mista triangulada fundamentada no mapeamento da literatura (19 artigos incluídos no repositório), survey de prontidão e entrevistas com análise categorial de Bardin. Os resultados revelam que a viabilidade econômica do ATaaS ancora-se na otimização do Custo Total de Uso (TCU) e em benefícios fiscais no Lucro Real (34%), enquanto sua eficácia biopsicossocial depende da governança de dados (Privacy by Design sob a LGPD) e de acordos de nível de serviço com substituição emergencial (hot-swap em até 24h, Uptime ≥ 98,5%).</w:t>
       </w:r>
     </w:p>
     <w:p>
@@ -240,7 +240,7 @@
           <w:color w:val="334155"/>
           <w:sz w:val="20"/>
         </w:rPr>
-        <w:t>Historically, the assimilation of Assistive Technologies (AT) within the Brazilian corporate landscape has been restricted to a transactional, capital expenditure (Capex) acquisition paradigm, primarily coerced by statutory employment quotas (Law No. 8,213/1991). This rigid ownership logic consistently precipitates maintenance asymmetries, chronic incompatibility with legacy Enterprise Resource Planning (ERP) systems, and alarming rates of technological abandonment (30% to 50%), undermining the career advancement and workplace retention of employees with disabilities. Grounded in Strategic Innovation Management and Product-Service Systems (PSS) theory, this paper investigates the paradigm shift from asset ownership toward Continuous Servitization, operationalized via the construct of Assistive Technology as a Service (ATaaS). Methodologically, a triangulated mixed-methods research design is deployed, comprising the PRISMA 2020 protocol (19 full-text articles analyzed), an exploratory readiness survey, and in-depth stakeholder interviews. Findings demonstrate that ATaaS financial feasibility rests upon Total Cost of Use (TCU) optimization and corporate tax deductibility, whereas its socio-technical success hinges upon Privacy-by-Design data governance under the Brazilian General Data Protection Law (LGPD) and stringent service level agreements (emergency hot-swap within 24 hours, Uptime ≥ 98.5%).</w:t>
+        <w:t>Historically, the assimilation of Assistive Technologies (AT) within the Brazilian corporate landscape has been restricted to a transactional, capital expenditure (Capex) acquisition paradigm, primarily coerced by statutory employment quotas (Law No. 8,213/1991). This rigid ownership logic consistently precipitates maintenance asymmetries, chronic incompatibility with legacy Enterprise Resource Planning (ERP) systems, and alarming rates of technological abandonment (30% to 50%), undermining the career advancement and workplace retention of employees with disabilities (Scherer, 2005; Sugawara et al., 2018). Grounded in Strategic Innovation Management and Product-Service Systems (PSS) theory, this paper investigates the paradigm shift from asset ownership toward Continuous Servitization, operationalized via the construct of Assistive Technology as a Service (ATaaS). Methodologically, a triangulated mixed-methods research design is deployed, comprising targeted state-of-the-art literature mapping (19 full-text articles analyzed), an exploratory readiness survey, and in-depth stakeholder interviews. Findings demonstrate that ATaaS financial feasibility rests upon Total Cost of Use (TCU) optimization and corporate tax deductibility, whereas its socio-technical success hinges upon Privacy-by-Design data governance under the Brazilian General Data Protection Law (LGPD) and stringent service level agreements (emergency hot-swap within 24 hours, Uptime ≥ 98.5%).</w:t>
       </w:r>
     </w:p>
     <w:p>
@@ -315,7 +315,7 @@
           <w:color w:val="334155"/>
           <w:sz w:val="20"/>
         </w:rPr>
-        <w:t>Não obstante a relevância desses imperativos éticos e regulatórios, a dinâmica prevalecente de incorporação de TAs no contexto corporativo brasileiro tem sido historicamente dominada por uma abordagem de conformidade legal compulsória e cartorial, catalisada pela fiscalização da Lei de Cotas (Lei nº 8.213/1991). Sob essa lógica reativa, as organizações tendem a efetuar aquisições transacionais pontuais de equipamentos de prateleira classificados como Despesas de Capital (Capex). Esse modelo desconsidera as complexas especificidades funcionais de cada usuário e a necessidade de mútua adaptação entre o artefato e o ecossistema tecnológico da firma (Leonard-Barton, 1988), culminando no abandono tecnológico precoce de 30% a 50% dos ativos.</w:t>
+        <w:t>Não obstante a relevância desses imperativos éticos e regulatórios, a dinâmica prevalecente de incorporação de TAs no contexto corporativo brasileiro tem sido historicamente dominada por uma abordagem de conformidade legal compulsória e cartorial, catalisada pela fiscalização da Lei de Cotas (Lei nº 8.213/1991). Sob essa lógica reativa, as organizações tendem a efetuar aquisições transacionais pontuais de equipamentos de prateleira classificados como Despesas de Capital (Capex). Esse modelo desconsidera as complexas especificidades funcionais de cada usuário e a necessidade de mútua adaptação entre o artefato e o ecossistema tecnológico da firma (Leonard-Barton, 1988), culminando no abandono tecnológico precoce de 30% a 50% dos ativos (Sugawara et al., 2018).</w:t>
       </w:r>
     </w:p>
     <w:p>
@@ -329,7 +329,7 @@
           <w:color w:val="334155"/>
           <w:sz w:val="20"/>
         </w:rPr>
-        <w:t>Diante do colapso do modelo transacional de Capex, desponta na vanguarda da literatura de gestão a transição paradigmática para a Servitização e os Sistemas Produto-Serviço (PSS) (Baines et al., 2009; Tukker, 2004; Kowalkowski et al., 2017). Ao migrar da compra do bem para a contratação contínua de capacidades como despesa operacional (Opex), surge o constructo de Tecnologia Assistiva como Serviço (ATaaS). A Questão Central de Pesquisa indaga: Como as organizações corporativas podem estruturar rotinas de gestão estratégica da inovação para migrar da aquisição transacional para modelos de servitização contínua em tecnologia assistiva (ATaaS/Opex), e de que forma determinantes tecnológicos, organizacionais e regulatórios condicionam a mitigação do abandono tecnológico e a sustentabilidade sociolaboral à luz dos ODS 8 e 10?</w:t>
+        <w:t>Diante do colapso do modelo transacional de Capex, desponta na vanguarda da literatura de gestão a transição paradigmática para a Servitização e os Sistemas Produto-Serviço (PSS) (Baines et al., 2009; Tukker, 2004; Kowalkowski et al., 2017). Ao migrar da compra do bem para a contratação contínua de capacidades como despesa operacional (Opex), surge o constructo de Tecnologia Assistiva como Serviço (ATaaS). A Questão Central de Pesquisa indaga: Como as organizações corporativas no Brasil podem estruturar rotinas de gestão estratégica da inovação para migrar da aquisição transacional para modelos de servitização contínua em tecnologia assistiva (ATaaS/Opex), e de que forma determinantes tecnológicos, organizacionais e regulatórios condicionam a mitigação do abandono tecnológico e a sustentabilidade sociolaboral à luz dos ODS 8 e 10?</w:t>
       </w:r>
     </w:p>
     <w:p>
@@ -384,7 +384,7 @@
           <w:color w:val="64748B"/>
           <w:sz w:val="17"/>
         </w:rPr>
-        <w:t>Figura 1: Protocolo Sistemático PRISMA 2020 e Desenho Metodológico Misto Triangulado (MMR).</w:t>
+        <w:t>Figura 1: Mapeamento do Estado da Arte da Literatura e Desenho Metodológico Misto Triangulado (MMR no Brasil).</w:t>
         <w:br/>
         <w:t>Fonte: Elaborado pelos autores (2026).</w:t>
       </w:r>
@@ -562,7 +562,7 @@
           <w:color w:val="334155"/>
           <w:sz w:val="20"/>
         </w:rPr>
-        <w:t>A Revisão Sistemática da Literatura seguiu o protocolo PRISMA 2020 em Scopus, Web of Science e PubMed, selecionando 19 artigos com texto integral em PDF catalogados em repositório local. O levantamento de campo primário articulou survey estruturado de prontidão e entrevistas semiestruturadas analisadas via Bardin (2016).</w:t>
+        <w:t>O levantamento bibliográfico estruturado operou sobre Scopus, Web of Science e PubMed, selecionando 19 artigos seminais com texto integral em PDF disponíveis no repositório do projeto. O levantamento de campo primário no Brasil articulou survey estruturado de prontidão organizacional e entrevistas semiestruturadas com gestores corporativos analisadas via Bardin (2016).</w:t>
       </w:r>
     </w:p>
     <w:p>
@@ -1258,7 +1258,7 @@
           <w:color w:val="0F172A"/>
           <w:sz w:val="26"/>
         </w:rPr>
-        <w:t>FRAMEWORK INTEGRADOR DE GESTÃO DA INOVAÇÃO ASSISTIVA BASEADO EM ATAAS</w:t>
+        <w:t>DIRETRIZES E RECOMENDAÇÕES GERENCIAIS PARA SERVITIZAÇÃO ASSISTIVA NO BRASIL (ADAPTAÇÃO PSS E MPT)</w:t>
       </w:r>
     </w:p>
     <w:p>
@@ -1272,7 +1272,7 @@
           <w:color w:val="334155"/>
           <w:sz w:val="20"/>
         </w:rPr>
-        <w:t>O modelo organiza-se em quatro fases articuladas: (1) Prospecção &amp; Decisão TCU; (2) Mútua Adaptação &amp; Acessibilidade Sistêmica; (3) Clima de Implementação &amp; Capacitação; e (4) Governança de SLA &amp; Economia Circular. Os KPIs contratuais estabelecem: Uptime de disponibilidade ≥ 98,5%, MTTR com substituição emergencial (hot-swap) ≤ 24 horas, e taxa de abandono tecnológico inferior a 5% em 12 meses.</w:t>
+        <w:t>Apresentam-se as diretrizes gerenciais articuladas a partir da adaptação dos modelos seminais de Sistemas Produto-Serviço (Tukker, 2004; Baines et al., 2009) e Matching Person &amp; Technology (Scherer, 2005) em quatro fases: (1) Prospecção &amp; Decisão TCU; (2) Mútua Adaptação &amp; Acessibilidade Sistêmica; (3) Clima de Implementação &amp; Capacitação; e (4) Governança de SLA &amp; Economia Circular. Os KPIs contratuais estabelecem: Uptime de disponibilidade ≥ 98,5%, MTTR com substituição emergencial (hot-swap) ≤ 24 horas, e taxa de abandono tecnológico inferior a 5% em 12 meses.</w:t>
       </w:r>
     </w:p>
     <w:p>
@@ -1327,7 +1327,7 @@
           <w:color w:val="64748B"/>
           <w:sz w:val="17"/>
         </w:rPr>
-        <w:t>Figura 2: Framework de Gestão da Inovação Assistiva Corporativa Baseado em ATaaS (Versão 5.0).</w:t>
+        <w:t>Figura 2: Diretrizes Gerenciais para Servitização Assistiva no Brasil (Adaptação PSS e MPT - Versão 5.0).</w:t>
         <w:br/>
         <w:t>Fonte: Elaborado pelos autores (2026).</w:t>
       </w:r>

</xml_diff>